<commit_message>
Tighten the about, drop the title rule, and clean the resume.
</commit_message>
<xml_diff>
--- a/Bannusha_Shaik_Data_Engineer.docx
+++ b/Bannusha_Shaik_Data_Engineer.docx
@@ -131,19 +131,6 @@
     </w:p>
     <w:p>
       <w:pPr>
-        <w:spacing w:after="40" w:line="200" w:lineRule="auto"/>
-      </w:pPr>
-      <w:r>
-        <w:rPr>
-          <w:rFonts w:ascii="Calibri" w:eastAsia="Calibri" w:hAnsi="Calibri" w:cs="Calibri"/>
-          <w:i/>
-          <w:sz w:val="20"/>
-        </w:rPr>
-        <w:t>Microsoft Power Platform  ·  SharePoint  ·  Office 365  ·  Power BI  ·  factory operations</w:t>
-      </w:r>
-    </w:p>
-    <w:p>
-      <w:pPr>
         <w:pStyle w:val="ListBullet"/>
         <w:spacing w:after="20" w:line="210" w:lineRule="auto"/>
         <w:ind w:hanging="216"/>
@@ -218,7 +205,7 @@
           <w:rFonts w:ascii="Calibri" w:eastAsia="Calibri" w:hAnsi="Calibri" w:cs="Calibri"/>
           <w:sz w:val="21"/>
         </w:rPr>
-        <w:t>Modeled delinquency risk on structured financial datasets and wrote the next action a stakeholder could take. Simulation, labeled as such.</w:t>
+        <w:t>Modeled delinquency risk on structured financial datasets and wrote the next action a stakeholder could take.</w:t>
       </w:r>
     </w:p>
     <w:p>
@@ -747,31 +734,31 @@
       </w:rPr>
     </w:lvl>
   </w:abstractNum>
-  <w:num w:numId="1" w16cid:durableId="1097603678">
+  <w:num w:numId="1" w16cid:durableId="1575239986">
     <w:abstractNumId w:val="8"/>
   </w:num>
-  <w:num w:numId="2" w16cid:durableId="1974023252">
+  <w:num w:numId="2" w16cid:durableId="1832408555">
     <w:abstractNumId w:val="6"/>
   </w:num>
-  <w:num w:numId="3" w16cid:durableId="208034252">
+  <w:num w:numId="3" w16cid:durableId="154031760">
     <w:abstractNumId w:val="5"/>
   </w:num>
-  <w:num w:numId="4" w16cid:durableId="1042944090">
+  <w:num w:numId="4" w16cid:durableId="25059830">
     <w:abstractNumId w:val="4"/>
   </w:num>
-  <w:num w:numId="5" w16cid:durableId="1280912998">
+  <w:num w:numId="5" w16cid:durableId="815026905">
     <w:abstractNumId w:val="7"/>
   </w:num>
-  <w:num w:numId="6" w16cid:durableId="1979070924">
+  <w:num w:numId="6" w16cid:durableId="520633014">
     <w:abstractNumId w:val="3"/>
   </w:num>
-  <w:num w:numId="7" w16cid:durableId="1153330862">
+  <w:num w:numId="7" w16cid:durableId="1174758194">
     <w:abstractNumId w:val="2"/>
   </w:num>
-  <w:num w:numId="8" w16cid:durableId="1687823697">
+  <w:num w:numId="8" w16cid:durableId="236211281">
     <w:abstractNumId w:val="1"/>
   </w:num>
-  <w:num w:numId="9" w16cid:durableId="777061445">
+  <w:num w:numId="9" w16cid:durableId="1474104062">
     <w:abstractNumId w:val="0"/>
   </w:num>
 </w:numbering>

</xml_diff>

<commit_message>
Restore about order and put the site projects on the resume.
</commit_message>
<xml_diff>
--- a/Bannusha_Shaik_Data_Engineer.docx
+++ b/Bannusha_Shaik_Data_Engineer.docx
@@ -81,14 +81,14 @@
           <w:rFonts w:ascii="Calibri" w:eastAsia="Calibri" w:hAnsi="Calibri" w:cs="Calibri"/>
           <w:sz w:val="21"/>
         </w:rPr>
-        <w:t>Data Engineer building ETL pipelines, operational data models, and the tables downstream teams query. At SKF (Fortune 500), replaced paper factory audits with an 11-screen production system: each audit is 1 queryable row across 5 pillars, with zone-scoped write-back and score-card views plant leads use. Independently shipped a YouTube ingestion pipeline (100 creators, about 3,500 videos) and a schema-locked SQL generator across 8 dialects with PostgreSQL query history. Skills: Python, SQL, PostgreSQL, panda</w:t>
+        <w:t>Data Engineer building ETL pipelines, operational data models, and the tables downstream teams query. At SKF (Fortune 500), replaced paper factory audits with an 11-screen production system: each audit is 1 queryable row across 5 pillars, with zone-scoped write-back and score-card views plant leads use. Projects: NammaPulse, a Bengaluru weather, air, and mobility warehouse; Creator Lab, a snapshot pipeline of 100 creators and about 3,500 videos; PlantLine, the production audit model. Skills: Python, SQL, Po</w:t>
       </w:r>
       <w:r>
         <w:rPr>
           <w:rFonts w:ascii="Calibri" w:eastAsia="Calibri" w:hAnsi="Calibri" w:cs="Calibri"/>
           <w:sz w:val="21"/>
         </w:rPr>
-        <w:t>s, data modeling, API ingestion, ETL, and Power BI. Seeking a Data Engineer role.</w:t>
+        <w:t>stgreSQL, pandas, data modeling, API ingestion, ETL, and Power BI. Seeking a Data Engineer role.</w:t>
       </w:r>
     </w:p>
     <w:p>
@@ -235,7 +235,44 @@
           <w:rFonts w:ascii="Calibri" w:eastAsia="Calibri" w:hAnsi="Calibri" w:cs="Calibri"/>
           <w:b/>
         </w:rPr>
-        <w:t>Indian Creator Lab  |  YouTube Data API, SQLite, pandas, scikit-learn, Streamlit</w:t>
+        <w:t>NammaPulse  |  Python, PostgreSQL, PostGIS</w:t>
+      </w:r>
+      <w:r>
+        <w:rPr>
+          <w:rFonts w:ascii="Calibri" w:eastAsia="Calibri" w:hAnsi="Calibri" w:cs="Calibri"/>
+          <w:sz w:val="21"/>
+        </w:rPr>
+        <w:tab/>
+        <w:t>In progress</w:t>
+      </w:r>
+    </w:p>
+    <w:p>
+      <w:pPr>
+        <w:pStyle w:val="ListBullet"/>
+        <w:spacing w:after="20" w:line="210" w:lineRule="auto"/>
+        <w:ind w:hanging="216"/>
+      </w:pPr>
+      <w:r>
+        <w:rPr>
+          <w:rFonts w:ascii="Calibri" w:eastAsia="Calibri" w:hAnsi="Calibri" w:cs="Calibri"/>
+          <w:sz w:val="21"/>
+        </w:rPr>
+        <w:t>Bengaluru weather, air, and mobility feeds that do not share a schema, a clock, or a location. Raw payload kept, bad rows rejected, three marts served.</w:t>
+      </w:r>
+    </w:p>
+    <w:p>
+      <w:pPr>
+        <w:tabs>
+          <w:tab w:val="right" w:pos="10512"/>
+        </w:tabs>
+        <w:spacing w:before="120" w:after="0" w:line="220" w:lineRule="auto"/>
+      </w:pPr>
+      <w:r>
+        <w:rPr>
+          <w:rFonts w:ascii="Calibri" w:eastAsia="Calibri" w:hAnsi="Calibri" w:cs="Calibri"/>
+          <w:b/>
+        </w:rPr>
+        <w:t>Creator Lab  |  Python, SQLite, YouTube Data API, Streamlit</w:t>
       </w:r>
       <w:r>
         <w:rPr>
@@ -270,21 +307,7 @@
           <w:rFonts w:ascii="Calibri" w:eastAsia="Calibri" w:hAnsi="Calibri" w:cs="Calibri"/>
           <w:sz w:val="21"/>
         </w:rPr>
-        <w:t>Ingested the YouTube Data API into SQLite for 100 Indian creators and about 3,500 videos, keyed by video and collect time, so views, likes, and comments are a time series rather than a one-time scrape.</w:t>
-      </w:r>
-    </w:p>
-    <w:p>
-      <w:pPr>
-        <w:pStyle w:val="ListBullet"/>
-        <w:spacing w:after="20" w:line="210" w:lineRule="auto"/>
-        <w:ind w:hanging="216"/>
-      </w:pPr>
-      <w:r>
-        <w:rPr>
-          <w:rFonts w:ascii="Calibri" w:eastAsia="Calibri" w:hAnsi="Calibri" w:cs="Calibri"/>
-          <w:sz w:val="21"/>
-        </w:rPr>
-        <w:t>Defined engagement as (likes + comments) / views and outlier as views versus that creator's median, then served a Streamlit app that scores a draft against the table.</w:t>
+        <w:t>A watchlist of 100 Indian creators and about 3,500 videos, snapshotted over time, so a draft title can be scored against a table instead of a one-time scrape.</w:t>
       </w:r>
     </w:p>
     <w:p>
@@ -299,7 +322,7 @@
           <w:rFonts w:ascii="Calibri" w:eastAsia="Calibri" w:hAnsi="Calibri" w:cs="Calibri"/>
           <w:b/>
         </w:rPr>
-        <w:t>GETYOQUERY  |  SQL, PostgreSQL, 8 dialects, schema-locked generation</w:t>
+        <w:t>PlantLine  |  Data modeling, SharePoint, Power Apps</w:t>
       </w:r>
       <w:r>
         <w:rPr>
@@ -308,18 +331,12 @@
         </w:rPr>
         <w:tab/>
       </w:r>
-    </w:p>
-    <w:p>
-      <w:pPr>
-        <w:spacing w:after="40" w:line="200" w:lineRule="auto"/>
-      </w:pPr>
       <w:r>
         <w:rPr>
           <w:rFonts w:ascii="Calibri" w:eastAsia="Calibri" w:hAnsi="Calibri" w:cs="Calibri"/>
-          <w:i/>
-          <w:sz w:val="20"/>
+          <w:sz w:val="21"/>
         </w:rPr>
-        <w:t>github.com/bannushaxddd/GETYOQUERY</w:t>
+        <w:t>In production</w:t>
       </w:r>
     </w:p>
     <w:p>
@@ -333,56 +350,7 @@
           <w:rFonts w:ascii="Calibri" w:eastAsia="Calibri" w:hAnsi="Calibri" w:cs="Calibri"/>
           <w:sz w:val="21"/>
         </w:rPr>
-        <w:t>Built an English-to-SQL service across 8 dialects (PostgreSQL, MySQL, SQLite, SQL Server, BigQuery, Snowflake, Oracle, DuckDB). CREATE TABLE is a hard allowlist, query history is stored in PostgreSQL, and execution is parameterized so generated SQL cannot invent column names.</w:t>
-      </w:r>
-    </w:p>
-    <w:p>
-      <w:pPr>
-        <w:tabs>
-          <w:tab w:val="right" w:pos="10512"/>
-        </w:tabs>
-        <w:spacing w:before="120" w:after="0" w:line="220" w:lineRule="auto"/>
-      </w:pPr>
-      <w:r>
-        <w:rPr>
-          <w:rFonts w:ascii="Calibri" w:eastAsia="Calibri" w:hAnsi="Calibri" w:cs="Calibri"/>
-          <w:b/>
-        </w:rPr>
-        <w:t>Pipeline observability  |  Prometheus, Grafana, Loki, Alertmanager, Docker</w:t>
-      </w:r>
-      <w:r>
-        <w:rPr>
-          <w:rFonts w:ascii="Calibri" w:eastAsia="Calibri" w:hAnsi="Calibri" w:cs="Calibri"/>
-          <w:sz w:val="21"/>
-        </w:rPr>
-        <w:tab/>
-      </w:r>
-    </w:p>
-    <w:p>
-      <w:pPr>
-        <w:spacing w:after="40" w:line="200" w:lineRule="auto"/>
-      </w:pPr>
-      <w:r>
-        <w:rPr>
-          <w:rFonts w:ascii="Calibri" w:eastAsia="Calibri" w:hAnsi="Calibri" w:cs="Calibri"/>
-          <w:i/>
-          <w:sz w:val="20"/>
-        </w:rPr>
-        <w:t>github.com/bannushaxddd/prometheus-grafana-stack</w:t>
-      </w:r>
-    </w:p>
-    <w:p>
-      <w:pPr>
-        <w:pStyle w:val="ListBullet"/>
-        <w:spacing w:after="20" w:line="210" w:lineRule="auto"/>
-        <w:ind w:hanging="216"/>
-      </w:pPr>
-      <w:r>
-        <w:rPr>
-          <w:rFonts w:ascii="Calibri" w:eastAsia="Calibri" w:hAnsi="Calibri" w:cs="Calibri"/>
-          <w:sz w:val="21"/>
-        </w:rPr>
-        <w:t>Stood up a Docker Compose metrics and log stack: Prometheus, Loki, Alertmanager, database exporters, custom application /metrics, and Grafana boards for system, app, and database health.</w:t>
+        <w:t>Paper 5S audits became a row a plant lead can query. Drafts stay out of the trend. Write-back is limited to the zones an identity is allowed to touch.</w:t>
       </w:r>
     </w:p>
     <w:p>
@@ -734,31 +702,31 @@
       </w:rPr>
     </w:lvl>
   </w:abstractNum>
-  <w:num w:numId="1" w16cid:durableId="1575239986">
+  <w:num w:numId="1" w16cid:durableId="1028721442">
     <w:abstractNumId w:val="8"/>
   </w:num>
-  <w:num w:numId="2" w16cid:durableId="1832408555">
+  <w:num w:numId="2" w16cid:durableId="1943028839">
     <w:abstractNumId w:val="6"/>
   </w:num>
-  <w:num w:numId="3" w16cid:durableId="154031760">
+  <w:num w:numId="3" w16cid:durableId="713431300">
     <w:abstractNumId w:val="5"/>
   </w:num>
-  <w:num w:numId="4" w16cid:durableId="25059830">
+  <w:num w:numId="4" w16cid:durableId="208303898">
     <w:abstractNumId w:val="4"/>
   </w:num>
-  <w:num w:numId="5" w16cid:durableId="815026905">
+  <w:num w:numId="5" w16cid:durableId="915548792">
     <w:abstractNumId w:val="7"/>
   </w:num>
-  <w:num w:numId="6" w16cid:durableId="520633014">
+  <w:num w:numId="6" w16cid:durableId="1235428410">
     <w:abstractNumId w:val="3"/>
   </w:num>
-  <w:num w:numId="7" w16cid:durableId="1174758194">
+  <w:num w:numId="7" w16cid:durableId="365909935">
     <w:abstractNumId w:val="2"/>
   </w:num>
-  <w:num w:numId="8" w16cid:durableId="236211281">
+  <w:num w:numId="8" w16cid:durableId="1005136621">
     <w:abstractNumId w:val="1"/>
   </w:num>
-  <w:num w:numId="9" w16cid:durableId="1474104062">
+  <w:num w:numId="9" w16cid:durableId="1673677243">
     <w:abstractNumId w:val="0"/>
   </w:num>
 </w:numbering>

</xml_diff>

<commit_message>
Add an experience section with SKF, Tata, and IEEE.
</commit_message>
<xml_diff>
--- a/Bannusha_Shaik_Data_Engineer.docx
+++ b/Bannusha_Shaik_Data_Engineer.docx
@@ -210,6 +210,43 @@
     </w:p>
     <w:p>
       <w:pPr>
+        <w:tabs>
+          <w:tab w:val="right" w:pos="10512"/>
+        </w:tabs>
+        <w:spacing w:before="120" w:after="0" w:line="220" w:lineRule="auto"/>
+      </w:pPr>
+      <w:r>
+        <w:rPr>
+          <w:rFonts w:ascii="Calibri" w:eastAsia="Calibri" w:hAnsi="Calibri" w:cs="Calibri"/>
+          <w:b/>
+        </w:rPr>
+        <w:t>Technical Support Team, IEEE</w:t>
+      </w:r>
+      <w:r>
+        <w:rPr>
+          <w:rFonts w:ascii="Calibri" w:eastAsia="Calibri" w:hAnsi="Calibri" w:cs="Calibri"/>
+          <w:sz w:val="21"/>
+        </w:rPr>
+        <w:tab/>
+        <w:t>Aug 2023 – Sep 2024</w:t>
+      </w:r>
+    </w:p>
+    <w:p>
+      <w:pPr>
+        <w:pStyle w:val="ListBullet"/>
+        <w:spacing w:after="20" w:line="210" w:lineRule="auto"/>
+        <w:ind w:hanging="216"/>
+      </w:pPr>
+      <w:r>
+        <w:rPr>
+          <w:rFonts w:ascii="Calibri" w:eastAsia="Calibri" w:hAnsi="Calibri" w:cs="Calibri"/>
+          <w:sz w:val="21"/>
+        </w:rPr>
+        <w:t>Supported technical sessions and event systems for the student branch: setup, troubleshooting, and keeping sessions running for speakers and attendees.</w:t>
+      </w:r>
+    </w:p>
+    <w:p>
+      <w:pPr>
         <w:pBdr>
           <w:bottom w:val="single" w:sz="8" w:space="1" w:color="000000"/>
         </w:pBdr>
@@ -330,12 +367,6 @@
           <w:sz w:val="21"/>
         </w:rPr>
         <w:tab/>
-      </w:r>
-      <w:r>
-        <w:rPr>
-          <w:rFonts w:ascii="Calibri" w:eastAsia="Calibri" w:hAnsi="Calibri" w:cs="Calibri"/>
-          <w:sz w:val="21"/>
-        </w:rPr>
         <w:t>In production</w:t>
       </w:r>
     </w:p>
@@ -702,31 +733,31 @@
       </w:rPr>
     </w:lvl>
   </w:abstractNum>
-  <w:num w:numId="1" w16cid:durableId="1028721442">
+  <w:num w:numId="1" w16cid:durableId="504902699">
     <w:abstractNumId w:val="8"/>
   </w:num>
-  <w:num w:numId="2" w16cid:durableId="1943028839">
+  <w:num w:numId="2" w16cid:durableId="1262713800">
     <w:abstractNumId w:val="6"/>
   </w:num>
-  <w:num w:numId="3" w16cid:durableId="713431300">
+  <w:num w:numId="3" w16cid:durableId="89083978">
     <w:abstractNumId w:val="5"/>
   </w:num>
-  <w:num w:numId="4" w16cid:durableId="208303898">
+  <w:num w:numId="4" w16cid:durableId="1770613103">
     <w:abstractNumId w:val="4"/>
   </w:num>
-  <w:num w:numId="5" w16cid:durableId="915548792">
+  <w:num w:numId="5" w16cid:durableId="1138835542">
     <w:abstractNumId w:val="7"/>
   </w:num>
-  <w:num w:numId="6" w16cid:durableId="1235428410">
+  <w:num w:numId="6" w16cid:durableId="1260602733">
     <w:abstractNumId w:val="3"/>
   </w:num>
-  <w:num w:numId="7" w16cid:durableId="365909935">
+  <w:num w:numId="7" w16cid:durableId="535895899">
     <w:abstractNumId w:val="2"/>
   </w:num>
-  <w:num w:numId="8" w16cid:durableId="1005136621">
+  <w:num w:numId="8" w16cid:durableId="17319104">
     <w:abstractNumId w:val="1"/>
   </w:num>
-  <w:num w:numId="9" w16cid:durableId="1673677243">
+  <w:num w:numId="9" w16cid:durableId="1892379087">
     <w:abstractNumId w:val="0"/>
   </w:num>
 </w:numbering>

</xml_diff>

<commit_message>
Mark the IEEE role as college student-branch work.
</commit_message>
<xml_diff>
--- a/Bannusha_Shaik_Data_Engineer.docx
+++ b/Bannusha_Shaik_Data_Engineer.docx
@@ -220,7 +220,7 @@
           <w:rFonts w:ascii="Calibri" w:eastAsia="Calibri" w:hAnsi="Calibri" w:cs="Calibri"/>
           <w:b/>
         </w:rPr>
-        <w:t>Technical Support Team, IEEE</w:t>
+        <w:t>Technical Support, IEEE Student Branch, PES College of Engineering</w:t>
       </w:r>
       <w:r>
         <w:rPr>
@@ -242,7 +242,7 @@
           <w:rFonts w:ascii="Calibri" w:eastAsia="Calibri" w:hAnsi="Calibri" w:cs="Calibri"/>
           <w:sz w:val="21"/>
         </w:rPr>
-        <w:t>Supported technical sessions and event systems for the student branch: setup, troubleshooting, and keeping sessions running for speakers and attendees.</w:t>
+        <w:t>College club role. Supported technical sessions for the IEEE student branch: setup, troubleshooting, and keeping events running for speakers and attendees.</w:t>
       </w:r>
     </w:p>
     <w:p>
@@ -733,31 +733,31 @@
       </w:rPr>
     </w:lvl>
   </w:abstractNum>
-  <w:num w:numId="1" w16cid:durableId="504902699">
+  <w:num w:numId="1" w16cid:durableId="747271140">
     <w:abstractNumId w:val="8"/>
   </w:num>
-  <w:num w:numId="2" w16cid:durableId="1262713800">
+  <w:num w:numId="2" w16cid:durableId="1193685812">
     <w:abstractNumId w:val="6"/>
   </w:num>
-  <w:num w:numId="3" w16cid:durableId="89083978">
+  <w:num w:numId="3" w16cid:durableId="1695616510">
     <w:abstractNumId w:val="5"/>
   </w:num>
-  <w:num w:numId="4" w16cid:durableId="1770613103">
+  <w:num w:numId="4" w16cid:durableId="996499856">
     <w:abstractNumId w:val="4"/>
   </w:num>
-  <w:num w:numId="5" w16cid:durableId="1138835542">
+  <w:num w:numId="5" w16cid:durableId="735056627">
     <w:abstractNumId w:val="7"/>
   </w:num>
-  <w:num w:numId="6" w16cid:durableId="1260602733">
+  <w:num w:numId="6" w16cid:durableId="481117502">
     <w:abstractNumId w:val="3"/>
   </w:num>
-  <w:num w:numId="7" w16cid:durableId="535895899">
+  <w:num w:numId="7" w16cid:durableId="1978997003">
     <w:abstractNumId w:val="2"/>
   </w:num>
-  <w:num w:numId="8" w16cid:durableId="17319104">
+  <w:num w:numId="8" w16cid:durableId="316811288">
     <w:abstractNumId w:val="1"/>
   </w:num>
-  <w:num w:numId="9" w16cid:durableId="1892379087">
+  <w:num w:numId="9" w16cid:durableId="1047684399">
     <w:abstractNumId w:val="0"/>
   </w:num>
 </w:numbering>

</xml_diff>

<commit_message>
Give experience its own cards and move SKF and IEEE out of projects.
</commit_message>
<xml_diff>
--- a/Bannusha_Shaik_Data_Engineer.docx
+++ b/Bannusha_Shaik_Data_Engineer.docx
@@ -81,14 +81,14 @@
           <w:rFonts w:ascii="Calibri" w:eastAsia="Calibri" w:hAnsi="Calibri" w:cs="Calibri"/>
           <w:sz w:val="21"/>
         </w:rPr>
-        <w:t>Data Engineer building ETL pipelines, operational data models, and the tables downstream teams query. At SKF (Fortune 500), replaced paper factory audits with an 11-screen production system: each audit is 1 queryable row across 5 pillars, with zone-scoped write-back and score-card views plant leads use. Projects: NammaPulse, a Bengaluru weather, air, and mobility warehouse; Creator Lab, a snapshot pipeline of 100 creators and about 3,500 videos; PlantLine, the production audit model. Skills: Python, SQL, Po</w:t>
+        <w:t>Data Engineer building ETL pipelines, operational data models, and the tables downstream teams query. At SKF (Fortune 500), replaced paper factory audits with an 11-screen production system: each audit is 1 queryable row across 5 pillars, with zone-scoped write-back and score-card views plant leads use. Also supported technical sessions for the IEEE student branch at PES, Aug 2023 to Sep 2024. Projects: NammaPulse, a Bengaluru weather, air, and mobility warehouse, and Creator Lab, a snapshot pipeline of 100</w:t>
       </w:r>
       <w:r>
         <w:rPr>
           <w:rFonts w:ascii="Calibri" w:eastAsia="Calibri" w:hAnsi="Calibri" w:cs="Calibri"/>
           <w:sz w:val="21"/>
         </w:rPr>
-        <w:t>stgreSQL, pandas, data modeling, API ingestion, ETL, and Power BI. Seeking a Data Engineer role.</w:t>
+        <w:t xml:space="preserve"> creators and about 3,500 videos. Skills: Python, SQL, PostgreSQL, pandas, data modeling, API ingestion, ETL, and Power BI. Seeking a Data Engineer role.</w:t>
       </w:r>
     </w:p>
     <w:p>
@@ -345,43 +345,6 @@
           <w:sz w:val="21"/>
         </w:rPr>
         <w:t>A watchlist of 100 Indian creators and about 3,500 videos, snapshotted over time, so a draft title can be scored against a table instead of a one-time scrape.</w:t>
-      </w:r>
-    </w:p>
-    <w:p>
-      <w:pPr>
-        <w:tabs>
-          <w:tab w:val="right" w:pos="10512"/>
-        </w:tabs>
-        <w:spacing w:before="120" w:after="0" w:line="220" w:lineRule="auto"/>
-      </w:pPr>
-      <w:r>
-        <w:rPr>
-          <w:rFonts w:ascii="Calibri" w:eastAsia="Calibri" w:hAnsi="Calibri" w:cs="Calibri"/>
-          <w:b/>
-        </w:rPr>
-        <w:t>PlantLine  |  Data modeling, SharePoint, Power Apps</w:t>
-      </w:r>
-      <w:r>
-        <w:rPr>
-          <w:rFonts w:ascii="Calibri" w:eastAsia="Calibri" w:hAnsi="Calibri" w:cs="Calibri"/>
-          <w:sz w:val="21"/>
-        </w:rPr>
-        <w:tab/>
-        <w:t>In production</w:t>
-      </w:r>
-    </w:p>
-    <w:p>
-      <w:pPr>
-        <w:pStyle w:val="ListBullet"/>
-        <w:spacing w:after="20" w:line="210" w:lineRule="auto"/>
-        <w:ind w:hanging="216"/>
-      </w:pPr>
-      <w:r>
-        <w:rPr>
-          <w:rFonts w:ascii="Calibri" w:eastAsia="Calibri" w:hAnsi="Calibri" w:cs="Calibri"/>
-          <w:sz w:val="21"/>
-        </w:rPr>
-        <w:t>Paper 5S audits became a row a plant lead can query. Drafts stay out of the trend. Write-back is limited to the zones an identity is allowed to touch.</w:t>
       </w:r>
     </w:p>
     <w:p>
@@ -733,31 +696,31 @@
       </w:rPr>
     </w:lvl>
   </w:abstractNum>
-  <w:num w:numId="1" w16cid:durableId="747271140">
+  <w:num w:numId="1" w16cid:durableId="1515804589">
     <w:abstractNumId w:val="8"/>
   </w:num>
-  <w:num w:numId="2" w16cid:durableId="1193685812">
+  <w:num w:numId="2" w16cid:durableId="674067206">
     <w:abstractNumId w:val="6"/>
   </w:num>
-  <w:num w:numId="3" w16cid:durableId="1695616510">
+  <w:num w:numId="3" w16cid:durableId="1508055355">
     <w:abstractNumId w:val="5"/>
   </w:num>
-  <w:num w:numId="4" w16cid:durableId="996499856">
+  <w:num w:numId="4" w16cid:durableId="269894635">
     <w:abstractNumId w:val="4"/>
   </w:num>
-  <w:num w:numId="5" w16cid:durableId="735056627">
+  <w:num w:numId="5" w16cid:durableId="1628705919">
     <w:abstractNumId w:val="7"/>
   </w:num>
-  <w:num w:numId="6" w16cid:durableId="481117502">
+  <w:num w:numId="6" w16cid:durableId="1650091289">
     <w:abstractNumId w:val="3"/>
   </w:num>
-  <w:num w:numId="7" w16cid:durableId="1978997003">
+  <w:num w:numId="7" w16cid:durableId="652485698">
     <w:abstractNumId w:val="2"/>
   </w:num>
-  <w:num w:numId="8" w16cid:durableId="316811288">
+  <w:num w:numId="8" w16cid:durableId="958101923">
     <w:abstractNumId w:val="1"/>
   </w:num>
-  <w:num w:numId="9" w16cid:durableId="1047684399">
+  <w:num w:numId="9" w16cid:durableId="1672563376">
     <w:abstractNumId w:val="0"/>
   </w:num>
 </w:numbering>

</xml_diff>

<commit_message>
Rewrite project bullets around shipped results.
</commit_message>
<xml_diff>
--- a/Bannusha_Shaik_Data_Engineer.docx
+++ b/Bannusha_Shaik_Data_Engineer.docx
@@ -272,43 +272,6 @@
           <w:rFonts w:ascii="Calibri" w:eastAsia="Calibri" w:hAnsi="Calibri" w:cs="Calibri"/>
           <w:b/>
         </w:rPr>
-        <w:t>NammaPulse  |  Python, PostgreSQL, PostGIS</w:t>
-      </w:r>
-      <w:r>
-        <w:rPr>
-          <w:rFonts w:ascii="Calibri" w:eastAsia="Calibri" w:hAnsi="Calibri" w:cs="Calibri"/>
-          <w:sz w:val="21"/>
-        </w:rPr>
-        <w:tab/>
-        <w:t>In progress</w:t>
-      </w:r>
-    </w:p>
-    <w:p>
-      <w:pPr>
-        <w:pStyle w:val="ListBullet"/>
-        <w:spacing w:after="20" w:line="210" w:lineRule="auto"/>
-        <w:ind w:hanging="216"/>
-      </w:pPr>
-      <w:r>
-        <w:rPr>
-          <w:rFonts w:ascii="Calibri" w:eastAsia="Calibri" w:hAnsi="Calibri" w:cs="Calibri"/>
-          <w:sz w:val="21"/>
-        </w:rPr>
-        <w:t>Bengaluru weather, air, and mobility feeds that do not share a schema, a clock, or a location. Raw payload kept, bad rows rejected, three marts served.</w:t>
-      </w:r>
-    </w:p>
-    <w:p>
-      <w:pPr>
-        <w:tabs>
-          <w:tab w:val="right" w:pos="10512"/>
-        </w:tabs>
-        <w:spacing w:before="120" w:after="0" w:line="220" w:lineRule="auto"/>
-      </w:pPr>
-      <w:r>
-        <w:rPr>
-          <w:rFonts w:ascii="Calibri" w:eastAsia="Calibri" w:hAnsi="Calibri" w:cs="Calibri"/>
-          <w:b/>
-        </w:rPr>
         <w:t>Creator Lab  |  Python, SQLite, YouTube Data API, Streamlit</w:t>
       </w:r>
       <w:r>
@@ -344,7 +307,86 @@
           <w:rFonts w:ascii="Calibri" w:eastAsia="Calibri" w:hAnsi="Calibri" w:cs="Calibri"/>
           <w:sz w:val="21"/>
         </w:rPr>
-        <w:t>A watchlist of 100 Indian creators and about 3,500 videos, snapshotted over time, so a draft title can be scored against a table instead of a one-time scrape.</w:t>
+        <w:t>Built a YouTube Data API pipeline into SQLite for 100 Indian creators (50 tech, 50 fashion) and about 3,500 videos, stored as snapshots so views, likes, and comments are a time series rather than a one-time scrape.</w:t>
+      </w:r>
+    </w:p>
+    <w:p>
+      <w:pPr>
+        <w:pStyle w:val="ListBullet"/>
+        <w:spacing w:after="20" w:line="210" w:lineRule="auto"/>
+        <w:ind w:hanging="216"/>
+      </w:pPr>
+      <w:r>
+        <w:rPr>
+          <w:rFonts w:ascii="Calibri" w:eastAsia="Calibri" w:hAnsi="Calibri" w:cs="Calibri"/>
+          <w:sz w:val="21"/>
+        </w:rPr>
+        <w:t>Defined engagement as (likes + comments) / views and outlier as views versus that creator's own median, so a small channel is not ranked against a large one.</w:t>
+      </w:r>
+    </w:p>
+    <w:p>
+      <w:pPr>
+        <w:pStyle w:val="ListBullet"/>
+        <w:spacing w:after="20" w:line="210" w:lineRule="auto"/>
+        <w:ind w:hanging="216"/>
+      </w:pPr>
+      <w:r>
+        <w:rPr>
+          <w:rFonts w:ascii="Calibri" w:eastAsia="Calibri" w:hAnsi="Calibri" w:cs="Calibri"/>
+          <w:sz w:val="21"/>
+        </w:rPr>
+        <w:t>Shipped a public Streamlit app that scores a draft title and cut against that table and returns a view range plus the nearest videos already stored.</w:t>
+      </w:r>
+    </w:p>
+    <w:p>
+      <w:pPr>
+        <w:tabs>
+          <w:tab w:val="right" w:pos="10512"/>
+        </w:tabs>
+        <w:spacing w:before="120" w:after="0" w:line="220" w:lineRule="auto"/>
+      </w:pPr>
+      <w:r>
+        <w:rPr>
+          <w:rFonts w:ascii="Calibri" w:eastAsia="Calibri" w:hAnsi="Calibri" w:cs="Calibri"/>
+          <w:b/>
+        </w:rPr>
+        <w:t>NammaPulse  |  Python, PostgreSQL, PostGIS</w:t>
+      </w:r>
+      <w:r>
+        <w:rPr>
+          <w:rFonts w:ascii="Calibri" w:eastAsia="Calibri" w:hAnsi="Calibri" w:cs="Calibri"/>
+          <w:sz w:val="21"/>
+        </w:rPr>
+        <w:tab/>
+        <w:t>In progress</w:t>
+      </w:r>
+    </w:p>
+    <w:p>
+      <w:pPr>
+        <w:pStyle w:val="ListBullet"/>
+        <w:spacing w:after="20" w:line="210" w:lineRule="auto"/>
+        <w:ind w:hanging="216"/>
+      </w:pPr>
+      <w:r>
+        <w:rPr>
+          <w:rFonts w:ascii="Calibri" w:eastAsia="Calibri" w:hAnsi="Calibri" w:cs="Calibri"/>
+          <w:sz w:val="21"/>
+        </w:rPr>
+        <w:t>Building a Bengaluru warehouse for weather, air, and mobility feeds that do not share a schema, a clock, or a location model.</w:t>
+      </w:r>
+    </w:p>
+    <w:p>
+      <w:pPr>
+        <w:pStyle w:val="ListBullet"/>
+        <w:spacing w:after="20" w:line="210" w:lineRule="auto"/>
+        <w:ind w:hanging="216"/>
+      </w:pPr>
+      <w:r>
+        <w:rPr>
+          <w:rFonts w:ascii="Calibri" w:eastAsia="Calibri" w:hAnsi="Calibri" w:cs="Calibri"/>
+          <w:sz w:val="21"/>
+        </w:rPr>
+        <w:t>Landing each pull as a raw payload, writing invalid rows to a reject table, and modeling ward, station, and date dimensions in PostgreSQL and PostGIS.</w:t>
       </w:r>
     </w:p>
     <w:p>
@@ -696,31 +738,31 @@
       </w:rPr>
     </w:lvl>
   </w:abstractNum>
-  <w:num w:numId="1" w16cid:durableId="1515804589">
+  <w:num w:numId="1" w16cid:durableId="536965736">
     <w:abstractNumId w:val="8"/>
   </w:num>
-  <w:num w:numId="2" w16cid:durableId="674067206">
+  <w:num w:numId="2" w16cid:durableId="764112068">
     <w:abstractNumId w:val="6"/>
   </w:num>
-  <w:num w:numId="3" w16cid:durableId="1508055355">
+  <w:num w:numId="3" w16cid:durableId="1709182531">
     <w:abstractNumId w:val="5"/>
   </w:num>
-  <w:num w:numId="4" w16cid:durableId="269894635">
+  <w:num w:numId="4" w16cid:durableId="1837531007">
     <w:abstractNumId w:val="4"/>
   </w:num>
-  <w:num w:numId="5" w16cid:durableId="1628705919">
+  <w:num w:numId="5" w16cid:durableId="1548953129">
     <w:abstractNumId w:val="7"/>
   </w:num>
-  <w:num w:numId="6" w16cid:durableId="1650091289">
+  <w:num w:numId="6" w16cid:durableId="1403791925">
     <w:abstractNumId w:val="3"/>
   </w:num>
-  <w:num w:numId="7" w16cid:durableId="652485698">
+  <w:num w:numId="7" w16cid:durableId="822350761">
     <w:abstractNumId w:val="2"/>
   </w:num>
-  <w:num w:numId="8" w16cid:durableId="958101923">
+  <w:num w:numId="8" w16cid:durableId="971403266">
     <w:abstractNumId w:val="1"/>
   </w:num>
-  <w:num w:numId="9" w16cid:durableId="1672563376">
+  <w:num w:numId="9" w16cid:durableId="1935747173">
     <w:abstractNumId w:val="0"/>
   </w:num>
 </w:numbering>

</xml_diff>

<commit_message>
Fill the resume page with the remaining shipped projects.
</commit_message>
<xml_diff>
--- a/Bannusha_Shaik_Data_Engineer.docx
+++ b/Bannusha_Shaik_Data_Engineer.docx
@@ -62,7 +62,7 @@
         <w:pBdr>
           <w:bottom w:val="single" w:sz="8" w:space="1" w:color="000000"/>
         </w:pBdr>
-        <w:spacing w:before="140" w:after="60" w:line="200" w:lineRule="auto"/>
+        <w:spacing w:before="100" w:after="20" w:line="200" w:lineRule="auto"/>
       </w:pPr>
       <w:r>
         <w:rPr>
@@ -74,7 +74,7 @@
     </w:p>
     <w:p>
       <w:pPr>
-        <w:spacing w:before="60" w:after="40" w:line="216" w:lineRule="auto"/>
+        <w:spacing w:before="40" w:after="20" w:line="210" w:lineRule="auto"/>
       </w:pPr>
       <w:r>
         <w:rPr>
@@ -96,7 +96,7 @@
         <w:pBdr>
           <w:bottom w:val="single" w:sz="8" w:space="1" w:color="000000"/>
         </w:pBdr>
-        <w:spacing w:before="140" w:after="60" w:line="200" w:lineRule="auto"/>
+        <w:spacing w:before="100" w:after="20" w:line="200" w:lineRule="auto"/>
       </w:pPr>
       <w:r>
         <w:rPr>
@@ -111,7 +111,7 @@
         <w:tabs>
           <w:tab w:val="right" w:pos="10512"/>
         </w:tabs>
-        <w:spacing w:before="120" w:after="0" w:line="220" w:lineRule="auto"/>
+        <w:spacing w:before="80" w:after="0" w:line="210" w:lineRule="auto"/>
       </w:pPr>
       <w:r>
         <w:rPr>
@@ -132,7 +132,7 @@
     <w:p>
       <w:pPr>
         <w:pStyle w:val="ListBullet"/>
-        <w:spacing w:after="20" w:line="210" w:lineRule="auto"/>
+        <w:spacing w:after="0" w:line="208" w:lineRule="auto"/>
         <w:ind w:hanging="216"/>
       </w:pPr>
       <w:r>
@@ -146,7 +146,7 @@
     <w:p>
       <w:pPr>
         <w:pStyle w:val="ListBullet"/>
-        <w:spacing w:after="20" w:line="210" w:lineRule="auto"/>
+        <w:spacing w:after="0" w:line="208" w:lineRule="auto"/>
         <w:ind w:hanging="216"/>
       </w:pPr>
       <w:r>
@@ -160,7 +160,7 @@
     <w:p>
       <w:pPr>
         <w:pStyle w:val="ListBullet"/>
-        <w:spacing w:after="20" w:line="210" w:lineRule="auto"/>
+        <w:spacing w:after="0" w:line="208" w:lineRule="auto"/>
         <w:ind w:hanging="216"/>
       </w:pPr>
       <w:r>
@@ -176,7 +176,7 @@
         <w:tabs>
           <w:tab w:val="right" w:pos="10512"/>
         </w:tabs>
-        <w:spacing w:before="120" w:after="0" w:line="220" w:lineRule="auto"/>
+        <w:spacing w:before="80" w:after="0" w:line="210" w:lineRule="auto"/>
       </w:pPr>
       <w:r>
         <w:rPr>
@@ -197,7 +197,7 @@
     <w:p>
       <w:pPr>
         <w:pStyle w:val="ListBullet"/>
-        <w:spacing w:after="20" w:line="210" w:lineRule="auto"/>
+        <w:spacing w:after="0" w:line="208" w:lineRule="auto"/>
         <w:ind w:hanging="216"/>
       </w:pPr>
       <w:r>
@@ -213,7 +213,7 @@
         <w:tabs>
           <w:tab w:val="right" w:pos="10512"/>
         </w:tabs>
-        <w:spacing w:before="120" w:after="0" w:line="220" w:lineRule="auto"/>
+        <w:spacing w:before="80" w:after="0" w:line="210" w:lineRule="auto"/>
       </w:pPr>
       <w:r>
         <w:rPr>
@@ -234,7 +234,7 @@
     <w:p>
       <w:pPr>
         <w:pStyle w:val="ListBullet"/>
-        <w:spacing w:after="20" w:line="210" w:lineRule="auto"/>
+        <w:spacing w:after="0" w:line="208" w:lineRule="auto"/>
         <w:ind w:hanging="216"/>
       </w:pPr>
       <w:r>
@@ -250,7 +250,7 @@
         <w:pBdr>
           <w:bottom w:val="single" w:sz="8" w:space="1" w:color="000000"/>
         </w:pBdr>
-        <w:spacing w:before="140" w:after="60" w:line="200" w:lineRule="auto"/>
+        <w:spacing w:before="100" w:after="20" w:line="200" w:lineRule="auto"/>
       </w:pPr>
       <w:r>
         <w:rPr>
@@ -265,7 +265,7 @@
         <w:tabs>
           <w:tab w:val="right" w:pos="10512"/>
         </w:tabs>
-        <w:spacing w:before="120" w:after="0" w:line="220" w:lineRule="auto"/>
+        <w:spacing w:before="80" w:after="0" w:line="210" w:lineRule="auto"/>
       </w:pPr>
       <w:r>
         <w:rPr>
@@ -299,7 +299,7 @@
     <w:p>
       <w:pPr>
         <w:pStyle w:val="ListBullet"/>
-        <w:spacing w:after="20" w:line="210" w:lineRule="auto"/>
+        <w:spacing w:after="0" w:line="208" w:lineRule="auto"/>
         <w:ind w:hanging="216"/>
       </w:pPr>
       <w:r>
@@ -313,7 +313,7 @@
     <w:p>
       <w:pPr>
         <w:pStyle w:val="ListBullet"/>
-        <w:spacing w:after="20" w:line="210" w:lineRule="auto"/>
+        <w:spacing w:after="0" w:line="208" w:lineRule="auto"/>
         <w:ind w:hanging="216"/>
       </w:pPr>
       <w:r>
@@ -327,7 +327,7 @@
     <w:p>
       <w:pPr>
         <w:pStyle w:val="ListBullet"/>
-        <w:spacing w:after="20" w:line="210" w:lineRule="auto"/>
+        <w:spacing w:after="0" w:line="208" w:lineRule="auto"/>
         <w:ind w:hanging="216"/>
       </w:pPr>
       <w:r>
@@ -343,7 +343,7 @@
         <w:tabs>
           <w:tab w:val="right" w:pos="10512"/>
         </w:tabs>
-        <w:spacing w:before="120" w:after="0" w:line="220" w:lineRule="auto"/>
+        <w:spacing w:before="80" w:after="0" w:line="210" w:lineRule="auto"/>
       </w:pPr>
       <w:r>
         <w:rPr>
@@ -364,7 +364,7 @@
     <w:p>
       <w:pPr>
         <w:pStyle w:val="ListBullet"/>
-        <w:spacing w:after="20" w:line="210" w:lineRule="auto"/>
+        <w:spacing w:after="0" w:line="208" w:lineRule="auto"/>
         <w:ind w:hanging="216"/>
       </w:pPr>
       <w:r>
@@ -378,7 +378,7 @@
     <w:p>
       <w:pPr>
         <w:pStyle w:val="ListBullet"/>
-        <w:spacing w:after="20" w:line="210" w:lineRule="auto"/>
+        <w:spacing w:after="0" w:line="208" w:lineRule="auto"/>
         <w:ind w:hanging="216"/>
       </w:pPr>
       <w:r>
@@ -391,10 +391,108 @@
     </w:p>
     <w:p>
       <w:pPr>
+        <w:tabs>
+          <w:tab w:val="right" w:pos="10512"/>
+        </w:tabs>
+        <w:spacing w:before="80" w:after="0" w:line="210" w:lineRule="auto"/>
+      </w:pPr>
+      <w:r>
+        <w:rPr>
+          <w:rFonts w:ascii="Calibri" w:eastAsia="Calibri" w:hAnsi="Calibri" w:cs="Calibri"/>
+          <w:b/>
+        </w:rPr>
+        <w:t>GETYOQUERY  |  SQL, PostgreSQL, 8 dialects</w:t>
+      </w:r>
+      <w:r>
+        <w:rPr>
+          <w:rFonts w:ascii="Calibri" w:eastAsia="Calibri" w:hAnsi="Calibri" w:cs="Calibri"/>
+          <w:sz w:val="21"/>
+        </w:rPr>
+        <w:tab/>
+      </w:r>
+    </w:p>
+    <w:p>
+      <w:pPr>
+        <w:spacing w:after="40" w:line="200" w:lineRule="auto"/>
+      </w:pPr>
+      <w:r>
+        <w:rPr>
+          <w:rFonts w:ascii="Calibri" w:eastAsia="Calibri" w:hAnsi="Calibri" w:cs="Calibri"/>
+          <w:i/>
+          <w:sz w:val="20"/>
+        </w:rPr>
+        <w:t>github.com/bannushaxddd/GETYOQUERY</w:t>
+      </w:r>
+    </w:p>
+    <w:p>
+      <w:pPr>
+        <w:pStyle w:val="ListBullet"/>
+        <w:spacing w:after="0" w:line="208" w:lineRule="auto"/>
+        <w:ind w:hanging="216"/>
+      </w:pPr>
+      <w:r>
+        <w:rPr>
+          <w:rFonts w:ascii="Calibri" w:eastAsia="Calibri" w:hAnsi="Calibri" w:cs="Calibri"/>
+          <w:sz w:val="21"/>
+        </w:rPr>
+        <w:t>Built an English-to-SQL service across 8 dialects (PostgreSQL, MySQL, SQLite, SQL Server, BigQuery, Snowflake, Oracle, DuckDB). CREATE TABLE is a hard allowlist, query history is stored in PostgreSQL, and execution is parameterized so generated SQL cannot invent column names.</w:t>
+      </w:r>
+    </w:p>
+    <w:p>
+      <w:pPr>
+        <w:tabs>
+          <w:tab w:val="right" w:pos="10512"/>
+        </w:tabs>
+        <w:spacing w:before="80" w:after="0" w:line="210" w:lineRule="auto"/>
+      </w:pPr>
+      <w:r>
+        <w:rPr>
+          <w:rFonts w:ascii="Calibri" w:eastAsia="Calibri" w:hAnsi="Calibri" w:cs="Calibri"/>
+          <w:b/>
+        </w:rPr>
+        <w:t>Pipeline observability  |  Prometheus, Grafana, Loki, Docker</w:t>
+      </w:r>
+      <w:r>
+        <w:rPr>
+          <w:rFonts w:ascii="Calibri" w:eastAsia="Calibri" w:hAnsi="Calibri" w:cs="Calibri"/>
+          <w:sz w:val="21"/>
+        </w:rPr>
+        <w:tab/>
+      </w:r>
+    </w:p>
+    <w:p>
+      <w:pPr>
+        <w:spacing w:after="40" w:line="200" w:lineRule="auto"/>
+      </w:pPr>
+      <w:r>
+        <w:rPr>
+          <w:rFonts w:ascii="Calibri" w:eastAsia="Calibri" w:hAnsi="Calibri" w:cs="Calibri"/>
+          <w:i/>
+          <w:sz w:val="20"/>
+        </w:rPr>
+        <w:t>github.com/bannushaxddd/prometheus-grafana-stack</w:t>
+      </w:r>
+    </w:p>
+    <w:p>
+      <w:pPr>
+        <w:pStyle w:val="ListBullet"/>
+        <w:spacing w:after="0" w:line="208" w:lineRule="auto"/>
+        <w:ind w:hanging="216"/>
+      </w:pPr>
+      <w:r>
+        <w:rPr>
+          <w:rFonts w:ascii="Calibri" w:eastAsia="Calibri" w:hAnsi="Calibri" w:cs="Calibri"/>
+          <w:sz w:val="21"/>
+        </w:rPr>
+        <w:t>Stood up a Docker Compose metrics and log stack: Prometheus, Loki, Alertmanager, database exporters, custom application /metrics, and Grafana boards for system, app, and database health.</w:t>
+      </w:r>
+    </w:p>
+    <w:p>
+      <w:pPr>
         <w:pBdr>
           <w:bottom w:val="single" w:sz="8" w:space="1" w:color="000000"/>
         </w:pBdr>
-        <w:spacing w:before="140" w:after="60" w:line="200" w:lineRule="auto"/>
+        <w:spacing w:before="100" w:after="20" w:line="200" w:lineRule="auto"/>
       </w:pPr>
       <w:r>
         <w:rPr>
@@ -409,7 +507,7 @@
         <w:tabs>
           <w:tab w:val="right" w:pos="10512"/>
         </w:tabs>
-        <w:spacing w:before="120" w:after="0" w:line="220" w:lineRule="auto"/>
+        <w:spacing w:before="80" w:after="0" w:line="210" w:lineRule="auto"/>
       </w:pPr>
       <w:r>
         <w:rPr>
@@ -465,7 +563,7 @@
         <w:pBdr>
           <w:bottom w:val="single" w:sz="8" w:space="1" w:color="000000"/>
         </w:pBdr>
-        <w:spacing w:before="140" w:after="60" w:line="200" w:lineRule="auto"/>
+        <w:spacing w:before="100" w:after="20" w:line="200" w:lineRule="auto"/>
       </w:pPr>
       <w:r>
         <w:rPr>
@@ -477,7 +575,7 @@
     </w:p>
     <w:p>
       <w:pPr>
-        <w:spacing w:before="20" w:after="20" w:line="220" w:lineRule="auto"/>
+        <w:spacing w:after="0" w:line="210" w:lineRule="auto"/>
       </w:pPr>
       <w:r>
         <w:rPr>
@@ -497,7 +595,7 @@
     </w:p>
     <w:p>
       <w:pPr>
-        <w:spacing w:before="20" w:after="20" w:line="220" w:lineRule="auto"/>
+        <w:spacing w:after="0" w:line="210" w:lineRule="auto"/>
       </w:pPr>
       <w:r>
         <w:rPr>
@@ -517,7 +615,7 @@
     </w:p>
     <w:p>
       <w:pPr>
-        <w:spacing w:before="20" w:after="20" w:line="220" w:lineRule="auto"/>
+        <w:spacing w:after="0" w:line="210" w:lineRule="auto"/>
       </w:pPr>
       <w:r>
         <w:rPr>
@@ -537,7 +635,7 @@
     </w:p>
     <w:p>
       <w:pPr>
-        <w:spacing w:before="20" w:after="20" w:line="220" w:lineRule="auto"/>
+        <w:spacing w:after="0" w:line="210" w:lineRule="auto"/>
       </w:pPr>
       <w:r>
         <w:rPr>
@@ -557,7 +655,7 @@
     </w:p>
     <w:sectPr>
       <w:pgSz w:w="12240" w:h="15840"/>
-      <w:pgMar w:top="720" w:right="864" w:bottom="720" w:left="864" w:header="720" w:footer="720" w:gutter="0"/>
+      <w:pgMar w:top="547" w:right="792" w:bottom="461" w:left="792" w:header="720" w:footer="720" w:gutter="0"/>
       <w:cols w:space="720"/>
       <w:docGrid w:linePitch="360"/>
     </w:sectPr>
@@ -738,31 +836,31 @@
       </w:rPr>
     </w:lvl>
   </w:abstractNum>
-  <w:num w:numId="1" w16cid:durableId="536965736">
+  <w:num w:numId="1" w16cid:durableId="905072253">
     <w:abstractNumId w:val="8"/>
   </w:num>
-  <w:num w:numId="2" w16cid:durableId="764112068">
+  <w:num w:numId="2" w16cid:durableId="845218395">
     <w:abstractNumId w:val="6"/>
   </w:num>
-  <w:num w:numId="3" w16cid:durableId="1709182531">
+  <w:num w:numId="3" w16cid:durableId="802238282">
     <w:abstractNumId w:val="5"/>
   </w:num>
-  <w:num w:numId="4" w16cid:durableId="1837531007">
+  <w:num w:numId="4" w16cid:durableId="1448619540">
     <w:abstractNumId w:val="4"/>
   </w:num>
-  <w:num w:numId="5" w16cid:durableId="1548953129">
+  <w:num w:numId="5" w16cid:durableId="283194877">
     <w:abstractNumId w:val="7"/>
   </w:num>
-  <w:num w:numId="6" w16cid:durableId="1403791925">
+  <w:num w:numId="6" w16cid:durableId="1215390281">
     <w:abstractNumId w:val="3"/>
   </w:num>
-  <w:num w:numId="7" w16cid:durableId="822350761">
+  <w:num w:numId="7" w16cid:durableId="1466770983">
     <w:abstractNumId w:val="2"/>
   </w:num>
-  <w:num w:numId="8" w16cid:durableId="971403266">
+  <w:num w:numId="8" w16cid:durableId="2096584292">
     <w:abstractNumId w:val="1"/>
   </w:num>
-  <w:num w:numId="9" w16cid:durableId="1935747173">
+  <w:num w:numId="9" w16cid:durableId="821115358">
     <w:abstractNumId w:val="0"/>
   </w:num>
 </w:numbering>

</xml_diff>

<commit_message>
Elaborate the project bullets with the decisions behind each pipeline.
</commit_message>
<xml_diff>
--- a/Bannusha_Shaik_Data_Engineer.docx
+++ b/Bannusha_Shaik_Data_Engineer.docx
@@ -81,14 +81,7 @@
           <w:rFonts w:ascii="Calibri" w:eastAsia="Calibri" w:hAnsi="Calibri" w:cs="Calibri"/>
           <w:sz w:val="21"/>
         </w:rPr>
-        <w:t>Data Engineer building ETL pipelines, operational data models, and the tables downstream teams query. At SKF (Fortune 500), replaced paper factory audits with an 11-screen production system: each audit is 1 queryable row across 5 pillars, with zone-scoped write-back and score-card views plant leads use. Also supported technical sessions for the IEEE student branch at PES, Aug 2023 to Sep 2024. Projects: NammaPulse, a Bengaluru weather, air, and mobility warehouse, and Creator Lab, a snapshot pipeline of 100</w:t>
-      </w:r>
-      <w:r>
-        <w:rPr>
-          <w:rFonts w:ascii="Calibri" w:eastAsia="Calibri" w:hAnsi="Calibri" w:cs="Calibri"/>
-          <w:sz w:val="21"/>
-        </w:rPr>
-        <w:t xml:space="preserve"> creators and about 3,500 videos. Skills: Python, SQL, PostgreSQL, pandas, data modeling, API ingestion, ETL, and Power BI. Seeking a Data Engineer role.</w:t>
+        <w:t>Data Engineer building ETL pipelines, operational data models, and the tables downstream teams query. At SKF (Fortune 500), replaced paper factory audits with an 11-screen production system: each audit is 1 queryable row across 5 pillars, with zone-scoped write-back and score-card views plant leads use. Skills: Python, SQL, PostgreSQL, pandas, data modeling, API ingestion, ETL, and Power BI. Seeking a Data Engineer role.</w:t>
       </w:r>
     </w:p>
     <w:p>
@@ -126,6 +119,12 @@
           <w:sz w:val="21"/>
         </w:rPr>
         <w:tab/>
+      </w:r>
+      <w:r>
+        <w:rPr>
+          <w:rFonts w:ascii="Calibri" w:eastAsia="Calibri" w:hAnsi="Calibri" w:cs="Calibri"/>
+          <w:sz w:val="21"/>
+        </w:rPr>
         <w:t>May 2026 – Present  |  Bangalore</w:t>
       </w:r>
     </w:p>
@@ -307,7 +306,7 @@
           <w:rFonts w:ascii="Calibri" w:eastAsia="Calibri" w:hAnsi="Calibri" w:cs="Calibri"/>
           <w:sz w:val="21"/>
         </w:rPr>
-        <w:t>Built a YouTube Data API pipeline into SQLite for 100 Indian creators (50 tech, 50 fashion) and about 3,500 videos, stored as snapshots so views, likes, and comments are a time series rather than a one-time scrape.</w:t>
+        <w:t>Ingested the YouTube Data API v3 into SQLite for 100 Indian creators (50 tech, 50 fashion and beauty) and about 3,500 videos. Grain is one snapshot of one video, so views, likes, and comments can be collected again instead of overwritten.</w:t>
       </w:r>
     </w:p>
     <w:p>
@@ -321,7 +320,7 @@
           <w:rFonts w:ascii="Calibri" w:eastAsia="Calibri" w:hAnsi="Calibri" w:cs="Calibri"/>
           <w:sz w:val="21"/>
         </w:rPr>
-        <w:t>Defined engagement as (likes + comments) / views and outlier as views versus that creator's own median, so a small channel is not ranked against a large one.</w:t>
+        <w:t>Defined engagement as (likes + comments) / views, because public YouTube does not expose shares. Defined outlier as this video's views divided by that creator's own median, so a small channel is not ranked against a large one.</w:t>
       </w:r>
     </w:p>
     <w:p>
@@ -335,7 +334,7 @@
           <w:rFonts w:ascii="Calibri" w:eastAsia="Calibri" w:hAnsi="Calibri" w:cs="Calibri"/>
           <w:sz w:val="21"/>
         </w:rPr>
-        <w:t>Shipped a public Streamlit app that scores a draft title and cut against that table and returns a view range plus the nearest videos already stored.</w:t>
+        <w:t>Built a feature table for duration buckets, Shorts versus long-form, title hooks, and publish hour, then shipped a public Streamlit app that scores a draft title and cut and returns a view range, an engagement rate, and the nearest videos already in the table.</w:t>
       </w:r>
     </w:p>
     <w:p>
@@ -372,7 +371,7 @@
           <w:rFonts w:ascii="Calibri" w:eastAsia="Calibri" w:hAnsi="Calibri" w:cs="Calibri"/>
           <w:sz w:val="21"/>
         </w:rPr>
-        <w:t>Building a Bengaluru warehouse for weather, air, and mobility feeds that do not share a schema, a clock, or a location model.</w:t>
+        <w:t>Designing a Bengaluru warehouse for weather, air, and mobility feeds that do not share a schema, a clock, or a location model. Each pull lands as an untouched raw payload before any cleaning.</w:t>
       </w:r>
     </w:p>
     <w:p>
@@ -386,7 +385,7 @@
           <w:rFonts w:ascii="Calibri" w:eastAsia="Calibri" w:hAnsi="Calibri" w:cs="Calibri"/>
           <w:sz w:val="21"/>
         </w:rPr>
-        <w:t>Landing each pull as a raw payload, writing invalid rows to a reject table, and modeling ward, station, and date dimensions in PostgreSQL and PostGIS.</w:t>
+        <w:t>Invalid rows — a missing timestamp, a missing location, or a value outside a declared range — go to a reject table with the rule that failed. Ward, station, and date are dimensions in PostgreSQL and PostGIS. An unknown location is surrogate key -1, not a dropped row.</w:t>
       </w:r>
     </w:p>
     <w:p>
@@ -435,7 +434,7 @@
           <w:rFonts w:ascii="Calibri" w:eastAsia="Calibri" w:hAnsi="Calibri" w:cs="Calibri"/>
           <w:sz w:val="21"/>
         </w:rPr>
-        <w:t>Built an English-to-SQL service across 8 dialects (PostgreSQL, MySQL, SQLite, SQL Server, BigQuery, Snowflake, Oracle, DuckDB). CREATE TABLE is a hard allowlist, query history is stored in PostgreSQL, and execution is parameterized so generated SQL cannot invent column names.</w:t>
+        <w:t>Built an English-to-SQL service across 8 dialects: PostgreSQL, MySQL, SQLite, SQL Server, BigQuery, Snowflake, Oracle, and DuckDB. A pasted CREATE TABLE is the allowlist, so generation may use only those table and column names.</w:t>
       </w:r>
     </w:p>
     <w:p>
@@ -484,7 +483,7 @@
           <w:rFonts w:ascii="Calibri" w:eastAsia="Calibri" w:hAnsi="Calibri" w:cs="Calibri"/>
           <w:sz w:val="21"/>
         </w:rPr>
-        <w:t>Stood up a Docker Compose metrics and log stack: Prometheus, Loki, Alertmanager, database exporters, custom application /metrics, and Grafana boards for system, app, and database health.</w:t>
+        <w:t>Stood up a Docker Compose stack a pipeline needs once it leaves a laptop: Prometheus for metrics, Loki for logs, Alertmanager for routing, and Grafana boards for system, application, and database health.</w:t>
       </w:r>
     </w:p>
     <w:p>
@@ -836,31 +835,31 @@
       </w:rPr>
     </w:lvl>
   </w:abstractNum>
-  <w:num w:numId="1" w16cid:durableId="905072253">
+  <w:num w:numId="1" w16cid:durableId="488710903">
     <w:abstractNumId w:val="8"/>
   </w:num>
-  <w:num w:numId="2" w16cid:durableId="845218395">
+  <w:num w:numId="2" w16cid:durableId="1443499725">
     <w:abstractNumId w:val="6"/>
   </w:num>
-  <w:num w:numId="3" w16cid:durableId="802238282">
+  <w:num w:numId="3" w16cid:durableId="1862013339">
     <w:abstractNumId w:val="5"/>
   </w:num>
-  <w:num w:numId="4" w16cid:durableId="1448619540">
+  <w:num w:numId="4" w16cid:durableId="1434352841">
     <w:abstractNumId w:val="4"/>
   </w:num>
-  <w:num w:numId="5" w16cid:durableId="283194877">
+  <w:num w:numId="5" w16cid:durableId="504782111">
     <w:abstractNumId w:val="7"/>
   </w:num>
-  <w:num w:numId="6" w16cid:durableId="1215390281">
+  <w:num w:numId="6" w16cid:durableId="1421558733">
     <w:abstractNumId w:val="3"/>
   </w:num>
-  <w:num w:numId="7" w16cid:durableId="1466770983">
+  <w:num w:numId="7" w16cid:durableId="1064177297">
     <w:abstractNumId w:val="2"/>
   </w:num>
-  <w:num w:numId="8" w16cid:durableId="2096584292">
+  <w:num w:numId="8" w16cid:durableId="1821966909">
     <w:abstractNumId w:val="1"/>
   </w:num>
-  <w:num w:numId="9" w16cid:durableId="821115358">
+  <w:num w:numId="9" w16cid:durableId="807355174">
     <w:abstractNumId w:val="0"/>
   </w:num>
 </w:numbering>

</xml_diff>

<commit_message>
Restyle the resume with a photo header, a short summary, and certifications last.
</commit_message>
<xml_diff>
--- a/Bannusha_Shaik_Data_Engineer.docx
+++ b/Bannusha_Shaik_Data_Engineer.docx
@@ -2,87 +2,156 @@
 <file path=word/document.xml><?xml version="1.0" encoding="utf-8"?>
 <w:document xmlns:wpc="http://schemas.microsoft.com/office/word/2010/wordprocessingCanvas" xmlns:cx="http://schemas.microsoft.com/office/drawing/2014/chartex" xmlns:cx1="http://schemas.microsoft.com/office/drawing/2015/9/8/chartex" xmlns:cx2="http://schemas.microsoft.com/office/drawing/2015/10/21/chartex" xmlns:cx3="http://schemas.microsoft.com/office/drawing/2016/5/9/chartex" xmlns:cx4="http://schemas.microsoft.com/office/drawing/2016/5/10/chartex" xmlns:cx5="http://schemas.microsoft.com/office/drawing/2016/5/11/chartex" xmlns:cx6="http://schemas.microsoft.com/office/drawing/2016/5/12/chartex" xmlns:cx7="http://schemas.microsoft.com/office/drawing/2016/5/13/chartex" xmlns:cx8="http://schemas.microsoft.com/office/drawing/2016/5/14/chartex" xmlns:mc="http://schemas.openxmlformats.org/markup-compatibility/2006" xmlns:aink="http://schemas.microsoft.com/office/drawing/2016/ink" xmlns:am3d="http://schemas.microsoft.com/office/drawing/2017/model3d" xmlns:o="urn:schemas-microsoft-com:office:office" xmlns:oel="http://schemas.microsoft.com/office/2019/extlst" xmlns:r="http://schemas.openxmlformats.org/officeDocument/2006/relationships" xmlns:m="http://schemas.openxmlformats.org/officeDocument/2006/math" xmlns:v="urn:schemas-microsoft-com:vml" xmlns:wp14="http://schemas.microsoft.com/office/word/2010/wordprocessingDrawing" xmlns:wp="http://schemas.openxmlformats.org/drawingml/2006/wordprocessingDrawing" xmlns:w10="urn:schemas-microsoft-com:office:word" xmlns:w="http://schemas.openxmlformats.org/wordprocessingml/2006/main" xmlns:w14="http://schemas.microsoft.com/office/word/2010/wordml" xmlns:w15="http://schemas.microsoft.com/office/word/2012/wordml" xmlns:w16cex="http://schemas.microsoft.com/office/word/2018/wordml/cex" xmlns:w16cid="http://schemas.microsoft.com/office/word/2016/wordml/cid" xmlns:w16="http://schemas.microsoft.com/office/word/2018/wordml" xmlns:w16du="http://schemas.microsoft.com/office/word/2023/wordml/word16du" xmlns:w16sdtdh="http://schemas.microsoft.com/office/word/2020/wordml/sdtdatahash" xmlns:w16sdtfl="http://schemas.microsoft.com/office/word/2024/wordml/sdtformatlock" xmlns:w16se="http://schemas.microsoft.com/office/word/2015/wordml/symex" xmlns:wpg="http://schemas.microsoft.com/office/word/2010/wordprocessingGroup" xmlns:wpi="http://schemas.microsoft.com/office/word/2010/wordprocessingInk" xmlns:wne="http://schemas.microsoft.com/office/word/2006/wordml" xmlns:wps="http://schemas.microsoft.com/office/word/2010/wordprocessingShape" mc:Ignorable="w14 w15 w16se w16cid w16 w16cex w16sdtdh w16sdtfl w16du wp14">
   <w:body>
-    <w:p>
-      <w:pPr>
-        <w:spacing w:after="40" w:line="220" w:lineRule="auto"/>
-        <w:jc w:val="center"/>
-      </w:pPr>
-      <w:r>
-        <w:rPr>
-          <w:rFonts w:ascii="Calibri" w:eastAsia="Calibri" w:hAnsi="Calibri" w:cs="Calibri"/>
-          <w:b/>
-          <w:sz w:val="36"/>
-        </w:rPr>
-        <w:t>BANNUSHA SHAIK</w:t>
-      </w:r>
-    </w:p>
-    <w:p>
-      <w:pPr>
-        <w:spacing w:after="40" w:line="200" w:lineRule="auto"/>
-        <w:jc w:val="center"/>
-      </w:pPr>
-      <w:r>
-        <w:rPr>
-          <w:rFonts w:ascii="Calibri" w:eastAsia="Calibri" w:hAnsi="Calibri" w:cs="Calibri"/>
-        </w:rPr>
-        <w:t>Data Engineer  |  Python  ·  SQL  ·  ETL  ·  Data Modeling  ·  PostgreSQL</w:t>
-      </w:r>
-    </w:p>
-    <w:p>
-      <w:pPr>
-        <w:spacing w:after="0" w:line="200" w:lineRule="auto"/>
-        <w:jc w:val="center"/>
-      </w:pPr>
-      <w:r>
-        <w:rPr>
-          <w:rFonts w:ascii="Calibri" w:eastAsia="Calibri" w:hAnsi="Calibri" w:cs="Calibri"/>
-          <w:sz w:val="19"/>
-        </w:rPr>
-        <w:t>Bangalore, India  ·  +91 8074671779  ·  bannushashaik85@gmail.com</w:t>
-      </w:r>
-    </w:p>
+    <w:tbl>
+      <w:tblPr>
+        <w:tblW w:w="0" w:type="auto"/>
+        <w:tblBorders>
+          <w:top w:val="nil"/>
+          <w:left w:val="nil"/>
+          <w:bottom w:val="nil"/>
+          <w:right w:val="nil"/>
+          <w:insideH w:val="nil"/>
+          <w:insideV w:val="nil"/>
+        </w:tblBorders>
+        <w:tblLayout w:type="fixed"/>
+        <w:tblLook w:val="04A0" w:firstRow="1" w:lastRow="0" w:firstColumn="1" w:lastColumn="0" w:noHBand="0" w:noVBand="1"/>
+      </w:tblPr>
+      <w:tblGrid>
+        <w:gridCol w:w="5328"/>
+        <w:gridCol w:w="5328"/>
+      </w:tblGrid>
+      <w:tr>
+        <w:tc>
+          <w:tcPr>
+            <w:tcW w:w="5328" w:type="dxa"/>
+          </w:tcPr>
+          <w:p>
+            <w:pPr>
+              <w:spacing w:after="0" w:line="200" w:lineRule="auto"/>
+              <w:jc w:val="center"/>
+            </w:pPr>
+            <w:r>
+              <w:rPr>
+                <w:rFonts w:ascii="Calibri" w:eastAsia="Calibri" w:hAnsi="Calibri" w:cs="Calibri"/>
+                <w:b/>
+                <w:sz w:val="36"/>
+              </w:rPr>
+              <w:t>BANNUSHA SHAIK</w:t>
+            </w:r>
+          </w:p>
+          <w:p>
+            <w:pPr>
+              <w:spacing w:before="20" w:after="20" w:line="200" w:lineRule="auto"/>
+              <w:jc w:val="center"/>
+            </w:pPr>
+            <w:r>
+              <w:rPr>
+                <w:rFonts w:ascii="Calibri" w:eastAsia="Calibri" w:hAnsi="Calibri" w:cs="Calibri"/>
+                <w:sz w:val="24"/>
+              </w:rPr>
+              <w:t>Data Engineer</w:t>
+            </w:r>
+          </w:p>
+          <w:p>
+            <w:pPr>
+              <w:spacing w:before="20" w:after="20" w:line="200" w:lineRule="auto"/>
+              <w:jc w:val="center"/>
+            </w:pPr>
+            <w:r>
+              <w:rPr>
+                <w:rFonts w:ascii="Calibri" w:eastAsia="Calibri" w:hAnsi="Calibri" w:cs="Calibri"/>
+                <w:sz w:val="20"/>
+              </w:rPr>
+              <w:t>I build the path from a source to a table someone can trust: collect, model, then serve.</w:t>
+            </w:r>
+          </w:p>
+          <w:p>
+            <w:pPr>
+              <w:spacing w:before="20" w:after="0" w:line="190" w:lineRule="auto"/>
+              <w:jc w:val="center"/>
+            </w:pPr>
+            <w:r>
+              <w:rPr>
+                <w:rFonts w:ascii="Calibri" w:eastAsia="Calibri" w:hAnsi="Calibri" w:cs="Calibri"/>
+                <w:sz w:val="18"/>
+              </w:rPr>
+              <w:t>Bangalore  |  +91 8074671779  |  bannushashaik85@gmail.com</w:t>
+            </w:r>
+          </w:p>
+          <w:p>
+            <w:pPr>
+              <w:spacing w:after="0" w:line="190" w:lineRule="auto"/>
+              <w:jc w:val="center"/>
+            </w:pPr>
+            <w:r>
+              <w:rPr>
+                <w:rFonts w:ascii="Calibri" w:eastAsia="Calibri" w:hAnsi="Calibri" w:cs="Calibri"/>
+                <w:sz w:val="18"/>
+              </w:rPr>
+              <w:t>GitHub  |  LinkedIn  |  bannusha.com</w:t>
+            </w:r>
+          </w:p>
+        </w:tc>
+        <w:tc>
+          <w:tcPr>
+            <w:tcW w:w="5328" w:type="dxa"/>
+          </w:tcPr>
+          <w:p>
+            <w:pPr>
+              <w:spacing w:after="0" w:line="200" w:lineRule="auto"/>
+              <w:jc w:val="right"/>
+            </w:pPr>
+            <w:r>
+              <w:rPr>
+                <w:noProof/>
+              </w:rPr>
+              <w:drawing>
+                <wp:inline distT="0" distB="0" distL="0" distR="0" wp14:anchorId="36B625EE" wp14:editId="04D9FA06">
+                  <wp:extent cx="868680" cy="1051560"/>
+                  <wp:effectExtent l="0" t="0" r="0" b="0"/>
+                  <wp:docPr id="1" name="Picture 1"/>
+                  <wp:cNvGraphicFramePr>
+                    <a:graphicFrameLocks xmlns:a="http://schemas.openxmlformats.org/drawingml/2006/main" noChangeAspect="1"/>
+                  </wp:cNvGraphicFramePr>
+                  <a:graphic xmlns:a="http://schemas.openxmlformats.org/drawingml/2006/main">
+                    <a:graphicData uri="http://schemas.openxmlformats.org/drawingml/2006/picture">
+                      <pic:pic xmlns:pic="http://schemas.openxmlformats.org/drawingml/2006/picture">
+                        <pic:nvPicPr>
+                          <pic:cNvPr id="0" name="photo.jpg"/>
+                          <pic:cNvPicPr/>
+                        </pic:nvPicPr>
+                        <pic:blipFill>
+                          <a:blip r:embed="rId6"/>
+                          <a:stretch>
+                            <a:fillRect/>
+                          </a:stretch>
+                        </pic:blipFill>
+                        <pic:spPr>
+                          <a:xfrm>
+                            <a:off x="0" y="0"/>
+                            <a:ext cx="868680" cy="1051560"/>
+                          </a:xfrm>
+                          <a:prstGeom prst="rect">
+                            <a:avLst/>
+                          </a:prstGeom>
+                        </pic:spPr>
+                      </pic:pic>
+                    </a:graphicData>
+                  </a:graphic>
+                </wp:inline>
+              </w:drawing>
+            </w:r>
+          </w:p>
+        </w:tc>
+      </w:tr>
+    </w:tbl>
     <w:p>
       <w:pPr>
         <w:pBdr>
           <w:bottom w:val="single" w:sz="12" w:space="1" w:color="000000"/>
         </w:pBdr>
-        <w:spacing w:after="120" w:line="200" w:lineRule="auto"/>
-        <w:jc w:val="center"/>
+        <w:spacing w:before="40" w:after="40" w:line="80" w:lineRule="auto"/>
       </w:pPr>
-      <w:r>
-        <w:rPr>
-          <w:rFonts w:ascii="Calibri" w:eastAsia="Calibri" w:hAnsi="Calibri" w:cs="Calibri"/>
-          <w:sz w:val="19"/>
-        </w:rPr>
-        <w:t>linkedin.com/in/bannushashaik400  ·  github.com/bannushaxddd  ·  bannusha.com</w:t>
-      </w:r>
-    </w:p>
-    <w:p>
-      <w:pPr>
-        <w:pBdr>
-          <w:bottom w:val="single" w:sz="8" w:space="1" w:color="000000"/>
-        </w:pBdr>
-        <w:spacing w:before="100" w:after="20" w:line="200" w:lineRule="auto"/>
-      </w:pPr>
-      <w:r>
-        <w:rPr>
-          <w:rFonts w:ascii="Calibri" w:eastAsia="Calibri" w:hAnsi="Calibri" w:cs="Calibri"/>
-          <w:b/>
-        </w:rPr>
-        <w:t>SUMMARY</w:t>
-      </w:r>
-    </w:p>
-    <w:p>
-      <w:pPr>
-        <w:spacing w:before="40" w:after="20" w:line="210" w:lineRule="auto"/>
-      </w:pPr>
-      <w:r>
-        <w:rPr>
-          <w:rFonts w:ascii="Calibri" w:eastAsia="Calibri" w:hAnsi="Calibri" w:cs="Calibri"/>
-          <w:sz w:val="21"/>
-        </w:rPr>
-        <w:t>Data Engineer building ETL pipelines, operational data models, and the tables downstream teams query. At SKF (Fortune 500), replaced paper factory audits with an 11-screen production system: each audit is 1 queryable row across 5 pillars, with zone-scoped write-back and score-card views plant leads use. Skills: Python, SQL, PostgreSQL, pandas, data modeling, API ingestion, ETL, and Power BI. Seeking a Data Engineer role.</w:t>
-      </w:r>
     </w:p>
     <w:p>
       <w:pPr>
@@ -119,12 +188,6 @@
           <w:sz w:val="21"/>
         </w:rPr>
         <w:tab/>
-      </w:r>
-      <w:r>
-        <w:rPr>
-          <w:rFonts w:ascii="Calibri" w:eastAsia="Calibri" w:hAnsi="Calibri" w:cs="Calibri"/>
-          <w:sz w:val="21"/>
-        </w:rPr>
         <w:t>May 2026 – Present  |  Bangalore</w:t>
       </w:r>
     </w:p>
@@ -498,77 +561,6 @@
           <w:rFonts w:ascii="Calibri" w:eastAsia="Calibri" w:hAnsi="Calibri" w:cs="Calibri"/>
           <w:b/>
         </w:rPr>
-        <w:t>EDUCATION</w:t>
-      </w:r>
-    </w:p>
-    <w:p>
-      <w:pPr>
-        <w:tabs>
-          <w:tab w:val="right" w:pos="10512"/>
-        </w:tabs>
-        <w:spacing w:before="80" w:after="0" w:line="210" w:lineRule="auto"/>
-      </w:pPr>
-      <w:r>
-        <w:rPr>
-          <w:rFonts w:ascii="Calibri" w:eastAsia="Calibri" w:hAnsi="Calibri" w:cs="Calibri"/>
-          <w:b/>
-        </w:rPr>
-        <w:t>B.Tech, Artificial Intelligence &amp; Machine Learning, PES College of Engineering</w:t>
-      </w:r>
-      <w:r>
-        <w:rPr>
-          <w:rFonts w:ascii="Calibri" w:eastAsia="Calibri" w:hAnsi="Calibri" w:cs="Calibri"/>
-          <w:sz w:val="21"/>
-        </w:rPr>
-        <w:tab/>
-        <w:t>2023 – Expected 2027</w:t>
-      </w:r>
-    </w:p>
-    <w:p>
-      <w:pPr>
-        <w:spacing w:after="40" w:line="200" w:lineRule="auto"/>
-      </w:pPr>
-      <w:r>
-        <w:rPr>
-          <w:rFonts w:ascii="Calibri" w:eastAsia="Calibri" w:hAnsi="Calibri" w:cs="Calibri"/>
-          <w:i/>
-          <w:sz w:val="20"/>
-        </w:rPr>
-        <w:t>Bangalore, India</w:t>
-      </w:r>
-    </w:p>
-    <w:p>
-      <w:pPr>
-        <w:spacing w:before="40" w:after="0" w:line="220" w:lineRule="auto"/>
-      </w:pPr>
-      <w:r>
-        <w:rPr>
-          <w:rFonts w:ascii="Calibri" w:eastAsia="Calibri" w:hAnsi="Calibri" w:cs="Calibri"/>
-          <w:b/>
-          <w:sz w:val="21"/>
-        </w:rPr>
-        <w:t xml:space="preserve">Certifications: </w:t>
-      </w:r>
-      <w:r>
-        <w:rPr>
-          <w:rFonts w:ascii="Calibri" w:eastAsia="Calibri" w:hAnsi="Calibri" w:cs="Calibri"/>
-          <w:sz w:val="21"/>
-        </w:rPr>
-        <w:t>Generative AI: Prompt Engineering Basics, IBM  ·  GenAI Powered Data Analytics, Tata Group (Forage), 2024</w:t>
-      </w:r>
-    </w:p>
-    <w:p>
-      <w:pPr>
-        <w:pBdr>
-          <w:bottom w:val="single" w:sz="8" w:space="1" w:color="000000"/>
-        </w:pBdr>
-        <w:spacing w:before="100" w:after="20" w:line="200" w:lineRule="auto"/>
-      </w:pPr>
-      <w:r>
-        <w:rPr>
-          <w:rFonts w:ascii="Calibri" w:eastAsia="Calibri" w:hAnsi="Calibri" w:cs="Calibri"/>
-          <w:b/>
-        </w:rPr>
         <w:t>TECHNICAL SKILLS</w:t>
       </w:r>
     </w:p>
@@ -650,6 +642,127 @@
           <w:sz w:val="21"/>
         </w:rPr>
         <w:t>Power BI, Streamlit, Grafana, Docker, Git, Power Apps, SharePoint, Office 365</w:t>
+      </w:r>
+    </w:p>
+    <w:p>
+      <w:pPr>
+        <w:pBdr>
+          <w:bottom w:val="single" w:sz="8" w:space="1" w:color="000000"/>
+        </w:pBdr>
+        <w:spacing w:before="100" w:after="20" w:line="200" w:lineRule="auto"/>
+      </w:pPr>
+      <w:r>
+        <w:rPr>
+          <w:rFonts w:ascii="Calibri" w:eastAsia="Calibri" w:hAnsi="Calibri" w:cs="Calibri"/>
+          <w:b/>
+        </w:rPr>
+        <w:t>EDUCATION</w:t>
+      </w:r>
+    </w:p>
+    <w:p>
+      <w:pPr>
+        <w:tabs>
+          <w:tab w:val="right" w:pos="10512"/>
+        </w:tabs>
+        <w:spacing w:before="80" w:after="0" w:line="210" w:lineRule="auto"/>
+      </w:pPr>
+      <w:r>
+        <w:rPr>
+          <w:rFonts w:ascii="Calibri" w:eastAsia="Calibri" w:hAnsi="Calibri" w:cs="Calibri"/>
+          <w:b/>
+        </w:rPr>
+        <w:t>B.Tech, Artificial Intelligence &amp; Machine Learning, PES College of Engineering</w:t>
+      </w:r>
+      <w:r>
+        <w:rPr>
+          <w:rFonts w:ascii="Calibri" w:eastAsia="Calibri" w:hAnsi="Calibri" w:cs="Calibri"/>
+          <w:sz w:val="21"/>
+        </w:rPr>
+        <w:tab/>
+        <w:t>2023 – Expected 2027</w:t>
+      </w:r>
+    </w:p>
+    <w:p>
+      <w:pPr>
+        <w:spacing w:after="40" w:line="200" w:lineRule="auto"/>
+      </w:pPr>
+      <w:r>
+        <w:rPr>
+          <w:rFonts w:ascii="Calibri" w:eastAsia="Calibri" w:hAnsi="Calibri" w:cs="Calibri"/>
+          <w:i/>
+          <w:sz w:val="20"/>
+        </w:rPr>
+        <w:t>Bangalore, India</w:t>
+      </w:r>
+    </w:p>
+    <w:p>
+      <w:pPr>
+        <w:pBdr>
+          <w:bottom w:val="single" w:sz="8" w:space="1" w:color="000000"/>
+        </w:pBdr>
+        <w:spacing w:before="100" w:after="20" w:line="200" w:lineRule="auto"/>
+      </w:pPr>
+      <w:r>
+        <w:rPr>
+          <w:rFonts w:ascii="Calibri" w:eastAsia="Calibri" w:hAnsi="Calibri" w:cs="Calibri"/>
+          <w:b/>
+        </w:rPr>
+        <w:t>CERTIFICATIONS</w:t>
+      </w:r>
+    </w:p>
+    <w:p>
+      <w:pPr>
+        <w:tabs>
+          <w:tab w:val="right" w:pos="10512"/>
+        </w:tabs>
+        <w:spacing w:before="80" w:after="0" w:line="210" w:lineRule="auto"/>
+      </w:pPr>
+      <w:r>
+        <w:rPr>
+          <w:rFonts w:ascii="Calibri" w:eastAsia="Calibri" w:hAnsi="Calibri" w:cs="Calibri"/>
+          <w:b/>
+        </w:rPr>
+        <w:t>Machine Learning Specialization, Coursera</w:t>
+      </w:r>
+      <w:r>
+        <w:rPr>
+          <w:rFonts w:ascii="Calibri" w:eastAsia="Calibri" w:hAnsi="Calibri" w:cs="Calibri"/>
+          <w:sz w:val="21"/>
+        </w:rPr>
+        <w:tab/>
+      </w:r>
+    </w:p>
+    <w:p>
+      <w:pPr>
+        <w:spacing w:after="40" w:line="200" w:lineRule="auto"/>
+      </w:pPr>
+      <w:r>
+        <w:rPr>
+          <w:rFonts w:ascii="Calibri" w:eastAsia="Calibri" w:hAnsi="Calibri" w:cs="Calibri"/>
+          <w:i/>
+          <w:sz w:val="20"/>
+        </w:rPr>
+        <w:t>coursera.org/account/accomplishments/specialization/F97RXO11QI47</w:t>
+      </w:r>
+    </w:p>
+    <w:p>
+      <w:pPr>
+        <w:spacing w:after="0" w:line="210" w:lineRule="auto"/>
+      </w:pPr>
+      <w:r>
+        <w:rPr>
+          <w:rFonts w:ascii="Calibri" w:eastAsia="Calibri" w:hAnsi="Calibri" w:cs="Calibri"/>
+          <w:b/>
+          <w:sz w:val="21"/>
+        </w:rPr>
+        <w:t xml:space="preserve">Also: </w:t>
+      </w:r>
+      <w:r>
+        <w:rPr>
+          <w:rFonts w:ascii="Calibri" w:eastAsia="Calibri" w:hAnsi="Calibri" w:cs="Calibri"/>
+          <w:sz w:val="21"/>
+        </w:rPr>
+        <w:t>Generative AI: Prompt Engineering Basics, IBM  ·  GenAI Powered Data Analytics, Tata Group (Forage), 2024</w:t>
       </w:r>
     </w:p>
     <w:sectPr>
@@ -835,31 +948,31 @@
       </w:rPr>
     </w:lvl>
   </w:abstractNum>
-  <w:num w:numId="1" w16cid:durableId="488710903">
+  <w:num w:numId="1" w16cid:durableId="1627272729">
     <w:abstractNumId w:val="8"/>
   </w:num>
-  <w:num w:numId="2" w16cid:durableId="1443499725">
+  <w:num w:numId="2" w16cid:durableId="412624949">
     <w:abstractNumId w:val="6"/>
   </w:num>
-  <w:num w:numId="3" w16cid:durableId="1862013339">
+  <w:num w:numId="3" w16cid:durableId="2119517302">
     <w:abstractNumId w:val="5"/>
   </w:num>
-  <w:num w:numId="4" w16cid:durableId="1434352841">
+  <w:num w:numId="4" w16cid:durableId="1376273263">
     <w:abstractNumId w:val="4"/>
   </w:num>
-  <w:num w:numId="5" w16cid:durableId="504782111">
+  <w:num w:numId="5" w16cid:durableId="1503280966">
     <w:abstractNumId w:val="7"/>
   </w:num>
-  <w:num w:numId="6" w16cid:durableId="1421558733">
+  <w:num w:numId="6" w16cid:durableId="1479221985">
     <w:abstractNumId w:val="3"/>
   </w:num>
-  <w:num w:numId="7" w16cid:durableId="1064177297">
+  <w:num w:numId="7" w16cid:durableId="1991442819">
     <w:abstractNumId w:val="2"/>
   </w:num>
-  <w:num w:numId="8" w16cid:durableId="1821966909">
+  <w:num w:numId="8" w16cid:durableId="195780925">
     <w:abstractNumId w:val="1"/>
   </w:num>
-  <w:num w:numId="9" w16cid:durableId="807355174">
+  <w:num w:numId="9" w16cid:durableId="1520729363">
     <w:abstractNumId w:val="0"/>
   </w:num>
 </w:numbering>

</xml_diff>

<commit_message>
Put a stronger summary in the first section.
</commit_message>
<xml_diff>
--- a/Bannusha_Shaik_Data_Engineer.docx
+++ b/Bannusha_Shaik_Data_Engineer.docx
@@ -50,19 +50,6 @@
                 <w:sz w:val="24"/>
               </w:rPr>
               <w:t>Data Engineer</w:t>
-            </w:r>
-          </w:p>
-          <w:p>
-            <w:pPr>
-              <w:spacing w:before="20" w:after="20" w:line="200" w:lineRule="auto"/>
-              <w:jc w:val="center"/>
-            </w:pPr>
-            <w:r>
-              <w:rPr>
-                <w:rFonts w:ascii="Calibri" w:eastAsia="Calibri" w:hAnsi="Calibri" w:cs="Calibri"/>
-                <w:sz w:val="20"/>
-              </w:rPr>
-              <w:t>I build the path from a source to a table someone can trust: collect, model, then serve.</w:t>
             </w:r>
           </w:p>
           <w:p>
@@ -106,7 +93,7 @@
                 <w:noProof/>
               </w:rPr>
               <w:drawing>
-                <wp:inline distT="0" distB="0" distL="0" distR="0" wp14:anchorId="36B625EE" wp14:editId="04D9FA06">
+                <wp:inline distT="0" distB="0" distL="0" distR="0" wp14:anchorId="141BAC62" wp14:editId="04B0F389">
                   <wp:extent cx="868680" cy="1051560"/>
                   <wp:effectExtent l="0" t="0" r="0" b="0"/>
                   <wp:docPr id="1" name="Picture 1"/>
@@ -152,6 +139,40 @@
         </w:pBdr>
         <w:spacing w:before="40" w:after="40" w:line="80" w:lineRule="auto"/>
       </w:pPr>
+    </w:p>
+    <w:p>
+      <w:pPr>
+        <w:pBdr>
+          <w:bottom w:val="single" w:sz="8" w:space="1" w:color="000000"/>
+        </w:pBdr>
+        <w:spacing w:before="100" w:after="20" w:line="200" w:lineRule="auto"/>
+      </w:pPr>
+      <w:r>
+        <w:rPr>
+          <w:rFonts w:ascii="Calibri" w:eastAsia="Calibri" w:hAnsi="Calibri" w:cs="Calibri"/>
+          <w:b/>
+        </w:rPr>
+        <w:t>SUMMARY</w:t>
+      </w:r>
+    </w:p>
+    <w:p>
+      <w:pPr>
+        <w:spacing w:before="40" w:after="20" w:line="210" w:lineRule="auto"/>
+      </w:pPr>
+      <w:r>
+        <w:rPr>
+          <w:rFonts w:ascii="Calibri" w:eastAsia="Calibri" w:hAnsi="Calibri" w:cs="Calibri"/>
+          <w:sz w:val="21"/>
+        </w:rPr>
+        <w:t>Data Engineer who would rather own the table than the chart on top of it. At SKF, a Fortune 500 plant in Bangalore, paper 5S audits are now a production system: 11 screens, one row per audit across five pillars, and write-back limited to the zones an identity is allowed to touch. Plant leads read the score-card. On my own time I built Creator Lab, a snapshot pipeline of 100 Indian creators and about 3,500 videos, and GETYOQUERY, schema-locked SQL across 8 dialects. Python, SQL, PostgreSQL, and ETL are the t</w:t>
+      </w:r>
+      <w:r>
+        <w:rPr>
+          <w:rFonts w:ascii="Calibri" w:eastAsia="Calibri" w:hAnsi="Calibri" w:cs="Calibri"/>
+          <w:sz w:val="21"/>
+        </w:rPr>
+        <w:t>ools. Data Engineer is the role I want.</w:t>
+      </w:r>
     </w:p>
     <w:p>
       <w:pPr>
@@ -692,6 +713,7 @@
           <w:i/>
           <w:sz w:val="20"/>
         </w:rPr>
+        <w:lastRenderedPageBreak/>
         <w:t>Bangalore, India</w:t>
       </w:r>
     </w:p>
@@ -948,31 +970,31 @@
       </w:rPr>
     </w:lvl>
   </w:abstractNum>
-  <w:num w:numId="1" w16cid:durableId="1627272729">
+  <w:num w:numId="1" w16cid:durableId="194511925">
     <w:abstractNumId w:val="8"/>
   </w:num>
-  <w:num w:numId="2" w16cid:durableId="412624949">
+  <w:num w:numId="2" w16cid:durableId="144250120">
     <w:abstractNumId w:val="6"/>
   </w:num>
-  <w:num w:numId="3" w16cid:durableId="2119517302">
+  <w:num w:numId="3" w16cid:durableId="633292876">
     <w:abstractNumId w:val="5"/>
   </w:num>
-  <w:num w:numId="4" w16cid:durableId="1376273263">
+  <w:num w:numId="4" w16cid:durableId="1943300889">
     <w:abstractNumId w:val="4"/>
   </w:num>
-  <w:num w:numId="5" w16cid:durableId="1503280966">
+  <w:num w:numId="5" w16cid:durableId="1272662859">
     <w:abstractNumId w:val="7"/>
   </w:num>
-  <w:num w:numId="6" w16cid:durableId="1479221985">
+  <w:num w:numId="6" w16cid:durableId="1415735778">
     <w:abstractNumId w:val="3"/>
   </w:num>
-  <w:num w:numId="7" w16cid:durableId="1991442819">
+  <w:num w:numId="7" w16cid:durableId="1423261524">
     <w:abstractNumId w:val="2"/>
   </w:num>
-  <w:num w:numId="8" w16cid:durableId="195780925">
+  <w:num w:numId="8" w16cid:durableId="1186602299">
     <w:abstractNumId w:val="1"/>
   </w:num>
-  <w:num w:numId="9" w16cid:durableId="1520729363">
+  <w:num w:numId="9" w16cid:durableId="100226877">
     <w:abstractNumId w:val="0"/>
   </w:num>
 </w:numbering>

</xml_diff>

<commit_message>
Keep the summary on one page.
</commit_message>
<xml_diff>
--- a/Bannusha_Shaik_Data_Engineer.docx
+++ b/Bannusha_Shaik_Data_Engineer.docx
@@ -93,7 +93,7 @@
                 <w:noProof/>
               </w:rPr>
               <w:drawing>
-                <wp:inline distT="0" distB="0" distL="0" distR="0" wp14:anchorId="141BAC62" wp14:editId="04B0F389">
+                <wp:inline distT="0" distB="0" distL="0" distR="0" wp14:anchorId="15343E0A" wp14:editId="103CB84A">
                   <wp:extent cx="868680" cy="1051560"/>
                   <wp:effectExtent l="0" t="0" r="0" b="0"/>
                   <wp:docPr id="1" name="Picture 1"/>
@@ -164,14 +164,7 @@
           <w:rFonts w:ascii="Calibri" w:eastAsia="Calibri" w:hAnsi="Calibri" w:cs="Calibri"/>
           <w:sz w:val="21"/>
         </w:rPr>
-        <w:t>Data Engineer who would rather own the table than the chart on top of it. At SKF, a Fortune 500 plant in Bangalore, paper 5S audits are now a production system: 11 screens, one row per audit across five pillars, and write-back limited to the zones an identity is allowed to touch. Plant leads read the score-card. On my own time I built Creator Lab, a snapshot pipeline of 100 Indian creators and about 3,500 videos, and GETYOQUERY, schema-locked SQL across 8 dialects. Python, SQL, PostgreSQL, and ETL are the t</w:t>
-      </w:r>
-      <w:r>
-        <w:rPr>
-          <w:rFonts w:ascii="Calibri" w:eastAsia="Calibri" w:hAnsi="Calibri" w:cs="Calibri"/>
-          <w:sz w:val="21"/>
-        </w:rPr>
-        <w:t>ools. Data Engineer is the role I want.</w:t>
+        <w:t>Data Engineer who would rather own the table than the chart on top of it. At SKF, a Fortune 500 plant in Bangalore, paper 5S audits are a production system: 11 screens, one row per audit across five pillars, write-back limited to allowed zones, and a score-card plant leads use. Independently built Creator Lab, a snapshot pipeline of 100 creators and about 3,500 videos, and GETYOQUERY, schema-locked SQL across 8 dialects. Python, SQL, PostgreSQL, ETL. Seeking a Data Engineer role.</w:t>
       </w:r>
     </w:p>
     <w:p>
@@ -713,7 +706,6 @@
           <w:i/>
           <w:sz w:val="20"/>
         </w:rPr>
-        <w:lastRenderedPageBreak/>
         <w:t>Bangalore, India</w:t>
       </w:r>
     </w:p>
@@ -729,6 +721,7 @@
           <w:rFonts w:ascii="Calibri" w:eastAsia="Calibri" w:hAnsi="Calibri" w:cs="Calibri"/>
           <w:b/>
         </w:rPr>
+        <w:lastRenderedPageBreak/>
         <w:t>CERTIFICATIONS</w:t>
       </w:r>
     </w:p>
@@ -970,31 +963,31 @@
       </w:rPr>
     </w:lvl>
   </w:abstractNum>
-  <w:num w:numId="1" w16cid:durableId="194511925">
+  <w:num w:numId="1" w16cid:durableId="990718906">
     <w:abstractNumId w:val="8"/>
   </w:num>
-  <w:num w:numId="2" w16cid:durableId="144250120">
+  <w:num w:numId="2" w16cid:durableId="1588683765">
     <w:abstractNumId w:val="6"/>
   </w:num>
-  <w:num w:numId="3" w16cid:durableId="633292876">
+  <w:num w:numId="3" w16cid:durableId="1621762459">
     <w:abstractNumId w:val="5"/>
   </w:num>
-  <w:num w:numId="4" w16cid:durableId="1943300889">
+  <w:num w:numId="4" w16cid:durableId="758403451">
     <w:abstractNumId w:val="4"/>
   </w:num>
-  <w:num w:numId="5" w16cid:durableId="1272662859">
+  <w:num w:numId="5" w16cid:durableId="1451320051">
     <w:abstractNumId w:val="7"/>
   </w:num>
-  <w:num w:numId="6" w16cid:durableId="1415735778">
+  <w:num w:numId="6" w16cid:durableId="2055225462">
     <w:abstractNumId w:val="3"/>
   </w:num>
-  <w:num w:numId="7" w16cid:durableId="1423261524">
+  <w:num w:numId="7" w16cid:durableId="1499539186">
     <w:abstractNumId w:val="2"/>
   </w:num>
-  <w:num w:numId="8" w16cid:durableId="1186602299">
+  <w:num w:numId="8" w16cid:durableId="558983206">
     <w:abstractNumId w:val="1"/>
   </w:num>
-  <w:num w:numId="9" w16cid:durableId="100226877">
+  <w:num w:numId="9" w16cid:durableId="464203553">
     <w:abstractNumId w:val="0"/>
   </w:num>
 </w:numbering>

</xml_diff>

<commit_message>
Pull certifications back onto page one.
</commit_message>
<xml_diff>
--- a/Bannusha_Shaik_Data_Engineer.docx
+++ b/Bannusha_Shaik_Data_Engineer.docx
@@ -93,7 +93,7 @@
                 <w:noProof/>
               </w:rPr>
               <w:drawing>
-                <wp:inline distT="0" distB="0" distL="0" distR="0" wp14:anchorId="15343E0A" wp14:editId="103CB84A">
+                <wp:inline distT="0" distB="0" distL="0" distR="0" wp14:anchorId="14053D85" wp14:editId="2815CF07">
                   <wp:extent cx="868680" cy="1051560"/>
                   <wp:effectExtent l="0" t="0" r="0" b="0"/>
                   <wp:docPr id="1" name="Picture 1"/>
@@ -145,7 +145,7 @@
         <w:pBdr>
           <w:bottom w:val="single" w:sz="8" w:space="1" w:color="000000"/>
         </w:pBdr>
-        <w:spacing w:before="100" w:after="20" w:line="200" w:lineRule="auto"/>
+        <w:spacing w:before="80" w:after="20" w:line="190" w:lineRule="auto"/>
       </w:pPr>
       <w:r>
         <w:rPr>
@@ -172,7 +172,7 @@
         <w:pBdr>
           <w:bottom w:val="single" w:sz="8" w:space="1" w:color="000000"/>
         </w:pBdr>
-        <w:spacing w:before="100" w:after="20" w:line="200" w:lineRule="auto"/>
+        <w:spacing w:before="80" w:after="20" w:line="190" w:lineRule="auto"/>
       </w:pPr>
       <w:r>
         <w:rPr>
@@ -187,7 +187,7 @@
         <w:tabs>
           <w:tab w:val="right" w:pos="10512"/>
         </w:tabs>
-        <w:spacing w:before="80" w:after="0" w:line="210" w:lineRule="auto"/>
+        <w:spacing w:before="60" w:after="0" w:line="200" w:lineRule="auto"/>
       </w:pPr>
       <w:r>
         <w:rPr>
@@ -252,7 +252,7 @@
         <w:tabs>
           <w:tab w:val="right" w:pos="10512"/>
         </w:tabs>
-        <w:spacing w:before="80" w:after="0" w:line="210" w:lineRule="auto"/>
+        <w:spacing w:before="60" w:after="0" w:line="200" w:lineRule="auto"/>
       </w:pPr>
       <w:r>
         <w:rPr>
@@ -289,7 +289,7 @@
         <w:tabs>
           <w:tab w:val="right" w:pos="10512"/>
         </w:tabs>
-        <w:spacing w:before="80" w:after="0" w:line="210" w:lineRule="auto"/>
+        <w:spacing w:before="60" w:after="0" w:line="200" w:lineRule="auto"/>
       </w:pPr>
       <w:r>
         <w:rPr>
@@ -326,7 +326,7 @@
         <w:pBdr>
           <w:bottom w:val="single" w:sz="8" w:space="1" w:color="000000"/>
         </w:pBdr>
-        <w:spacing w:before="100" w:after="20" w:line="200" w:lineRule="auto"/>
+        <w:spacing w:before="80" w:after="20" w:line="190" w:lineRule="auto"/>
       </w:pPr>
       <w:r>
         <w:rPr>
@@ -341,7 +341,7 @@
         <w:tabs>
           <w:tab w:val="right" w:pos="10512"/>
         </w:tabs>
-        <w:spacing w:before="80" w:after="0" w:line="210" w:lineRule="auto"/>
+        <w:spacing w:before="60" w:after="0" w:line="200" w:lineRule="auto"/>
       </w:pPr>
       <w:r>
         <w:rPr>
@@ -419,7 +419,7 @@
         <w:tabs>
           <w:tab w:val="right" w:pos="10512"/>
         </w:tabs>
-        <w:spacing w:before="80" w:after="0" w:line="210" w:lineRule="auto"/>
+        <w:spacing w:before="60" w:after="0" w:line="200" w:lineRule="auto"/>
       </w:pPr>
       <w:r>
         <w:rPr>
@@ -470,7 +470,7 @@
         <w:tabs>
           <w:tab w:val="right" w:pos="10512"/>
         </w:tabs>
-        <w:spacing w:before="80" w:after="0" w:line="210" w:lineRule="auto"/>
+        <w:spacing w:before="60" w:after="0" w:line="200" w:lineRule="auto"/>
       </w:pPr>
       <w:r>
         <w:rPr>
@@ -519,7 +519,7 @@
         <w:tabs>
           <w:tab w:val="right" w:pos="10512"/>
         </w:tabs>
-        <w:spacing w:before="80" w:after="0" w:line="210" w:lineRule="auto"/>
+        <w:spacing w:before="60" w:after="0" w:line="200" w:lineRule="auto"/>
       </w:pPr>
       <w:r>
         <w:rPr>
@@ -568,7 +568,7 @@
         <w:pBdr>
           <w:bottom w:val="single" w:sz="8" w:space="1" w:color="000000"/>
         </w:pBdr>
-        <w:spacing w:before="100" w:after="20" w:line="200" w:lineRule="auto"/>
+        <w:spacing w:before="80" w:after="20" w:line="190" w:lineRule="auto"/>
       </w:pPr>
       <w:r>
         <w:rPr>
@@ -663,7 +663,7 @@
         <w:pBdr>
           <w:bottom w:val="single" w:sz="8" w:space="1" w:color="000000"/>
         </w:pBdr>
-        <w:spacing w:before="100" w:after="20" w:line="200" w:lineRule="auto"/>
+        <w:spacing w:before="80" w:after="20" w:line="190" w:lineRule="auto"/>
       </w:pPr>
       <w:r>
         <w:rPr>
@@ -678,7 +678,7 @@
         <w:tabs>
           <w:tab w:val="right" w:pos="10512"/>
         </w:tabs>
-        <w:spacing w:before="80" w:after="0" w:line="210" w:lineRule="auto"/>
+        <w:spacing w:before="60" w:after="0" w:line="200" w:lineRule="auto"/>
       </w:pPr>
       <w:r>
         <w:rPr>
@@ -714,14 +714,13 @@
         <w:pBdr>
           <w:bottom w:val="single" w:sz="8" w:space="1" w:color="000000"/>
         </w:pBdr>
-        <w:spacing w:before="100" w:after="20" w:line="200" w:lineRule="auto"/>
+        <w:spacing w:before="80" w:after="20" w:line="190" w:lineRule="auto"/>
       </w:pPr>
       <w:r>
         <w:rPr>
           <w:rFonts w:ascii="Calibri" w:eastAsia="Calibri" w:hAnsi="Calibri" w:cs="Calibri"/>
           <w:b/>
         </w:rPr>
-        <w:lastRenderedPageBreak/>
         <w:t>CERTIFICATIONS</w:t>
       </w:r>
     </w:p>
@@ -730,13 +729,14 @@
         <w:tabs>
           <w:tab w:val="right" w:pos="10512"/>
         </w:tabs>
-        <w:spacing w:before="80" w:after="0" w:line="210" w:lineRule="auto"/>
+        <w:spacing w:before="60" w:after="0" w:line="200" w:lineRule="auto"/>
       </w:pPr>
       <w:r>
         <w:rPr>
           <w:rFonts w:ascii="Calibri" w:eastAsia="Calibri" w:hAnsi="Calibri" w:cs="Calibri"/>
           <w:b/>
         </w:rPr>
+        <w:lastRenderedPageBreak/>
         <w:t>Machine Learning Specialization, Coursera</w:t>
       </w:r>
       <w:r>
@@ -782,7 +782,7 @@
     </w:p>
     <w:sectPr>
       <w:pgSz w:w="12240" w:h="15840"/>
-      <w:pgMar w:top="547" w:right="792" w:bottom="461" w:left="792" w:header="720" w:footer="720" w:gutter="0"/>
+      <w:pgMar w:top="547" w:right="792" w:bottom="403" w:left="792" w:header="720" w:footer="720" w:gutter="0"/>
       <w:cols w:space="720"/>
       <w:docGrid w:linePitch="360"/>
     </w:sectPr>
@@ -963,31 +963,31 @@
       </w:rPr>
     </w:lvl>
   </w:abstractNum>
-  <w:num w:numId="1" w16cid:durableId="990718906">
+  <w:num w:numId="1" w16cid:durableId="915632914">
     <w:abstractNumId w:val="8"/>
   </w:num>
-  <w:num w:numId="2" w16cid:durableId="1588683765">
+  <w:num w:numId="2" w16cid:durableId="214583787">
     <w:abstractNumId w:val="6"/>
   </w:num>
-  <w:num w:numId="3" w16cid:durableId="1621762459">
+  <w:num w:numId="3" w16cid:durableId="1528061414">
     <w:abstractNumId w:val="5"/>
   </w:num>
-  <w:num w:numId="4" w16cid:durableId="758403451">
+  <w:num w:numId="4" w16cid:durableId="1348287648">
     <w:abstractNumId w:val="4"/>
   </w:num>
-  <w:num w:numId="5" w16cid:durableId="1451320051">
+  <w:num w:numId="5" w16cid:durableId="432290111">
     <w:abstractNumId w:val="7"/>
   </w:num>
-  <w:num w:numId="6" w16cid:durableId="2055225462">
+  <w:num w:numId="6" w16cid:durableId="10685962">
     <w:abstractNumId w:val="3"/>
   </w:num>
-  <w:num w:numId="7" w16cid:durableId="1499539186">
+  <w:num w:numId="7" w16cid:durableId="168176242">
     <w:abstractNumId w:val="2"/>
   </w:num>
-  <w:num w:numId="8" w16cid:durableId="558983206">
+  <w:num w:numId="8" w16cid:durableId="2024671746">
     <w:abstractNumId w:val="1"/>
   </w:num>
-  <w:num w:numId="9" w16cid:durableId="464203553">
+  <w:num w:numId="9" w16cid:durableId="559948087">
     <w:abstractNumId w:val="0"/>
   </w:num>
 </w:numbering>

</xml_diff>

<commit_message>
Shorten the summary so the resume stays one page.
</commit_message>
<xml_diff>
--- a/Bannusha_Shaik_Data_Engineer.docx
+++ b/Bannusha_Shaik_Data_Engineer.docx
@@ -93,7 +93,7 @@
                 <w:noProof/>
               </w:rPr>
               <w:drawing>
-                <wp:inline distT="0" distB="0" distL="0" distR="0" wp14:anchorId="14053D85" wp14:editId="2815CF07">
+                <wp:inline distT="0" distB="0" distL="0" distR="0" wp14:anchorId="478B083D" wp14:editId="3BC7E21A">
                   <wp:extent cx="868680" cy="1051560"/>
                   <wp:effectExtent l="0" t="0" r="0" b="0"/>
                   <wp:docPr id="1" name="Picture 1"/>
@@ -164,7 +164,7 @@
           <w:rFonts w:ascii="Calibri" w:eastAsia="Calibri" w:hAnsi="Calibri" w:cs="Calibri"/>
           <w:sz w:val="21"/>
         </w:rPr>
-        <w:t>Data Engineer who would rather own the table than the chart on top of it. At SKF, a Fortune 500 plant in Bangalore, paper 5S audits are a production system: 11 screens, one row per audit across five pillars, write-back limited to allowed zones, and a score-card plant leads use. Independently built Creator Lab, a snapshot pipeline of 100 creators and about 3,500 videos, and GETYOQUERY, schema-locked SQL across 8 dialects. Python, SQL, PostgreSQL, ETL. Seeking a Data Engineer role.</w:t>
+        <w:t>Data Engineer who would rather own the table than the chart on top of it. At SKF, a Fortune 500 plant in Bangalore, paper audits are a production system: 11 screens, one row per audit across five pillars, and a score-card plant leads use. Independently built Creator Lab, 100 creators and about 3,500 videos snapshotted over time, and GETYOQUERY, schema-locked SQL across 8 dialects.</w:t>
       </w:r>
     </w:p>
     <w:p>
@@ -963,31 +963,31 @@
       </w:rPr>
     </w:lvl>
   </w:abstractNum>
-  <w:num w:numId="1" w16cid:durableId="915632914">
+  <w:num w:numId="1" w16cid:durableId="1869945235">
     <w:abstractNumId w:val="8"/>
   </w:num>
-  <w:num w:numId="2" w16cid:durableId="214583787">
+  <w:num w:numId="2" w16cid:durableId="1223906838">
     <w:abstractNumId w:val="6"/>
   </w:num>
-  <w:num w:numId="3" w16cid:durableId="1528061414">
+  <w:num w:numId="3" w16cid:durableId="1343126744">
     <w:abstractNumId w:val="5"/>
   </w:num>
-  <w:num w:numId="4" w16cid:durableId="1348287648">
+  <w:num w:numId="4" w16cid:durableId="238180321">
     <w:abstractNumId w:val="4"/>
   </w:num>
-  <w:num w:numId="5" w16cid:durableId="432290111">
+  <w:num w:numId="5" w16cid:durableId="550300">
     <w:abstractNumId w:val="7"/>
   </w:num>
-  <w:num w:numId="6" w16cid:durableId="10685962">
+  <w:num w:numId="6" w16cid:durableId="1054738492">
     <w:abstractNumId w:val="3"/>
   </w:num>
-  <w:num w:numId="7" w16cid:durableId="168176242">
+  <w:num w:numId="7" w16cid:durableId="1854805795">
     <w:abstractNumId w:val="2"/>
   </w:num>
-  <w:num w:numId="8" w16cid:durableId="2024671746">
+  <w:num w:numId="8" w16cid:durableId="2111704038">
     <w:abstractNumId w:val="1"/>
   </w:num>
-  <w:num w:numId="9" w16cid:durableId="559948087">
+  <w:num w:numId="9" w16cid:durableId="600798461">
     <w:abstractNumId w:val="0"/>
   </w:num>
 </w:numbering>

</xml_diff>

<commit_message>
Fit the summary and certifications on one page.
</commit_message>
<xml_diff>
--- a/Bannusha_Shaik_Data_Engineer.docx
+++ b/Bannusha_Shaik_Data_Engineer.docx
@@ -93,7 +93,7 @@
                 <w:noProof/>
               </w:rPr>
               <w:drawing>
-                <wp:inline distT="0" distB="0" distL="0" distR="0" wp14:anchorId="478B083D" wp14:editId="3BC7E21A">
+                <wp:inline distT="0" distB="0" distL="0" distR="0" wp14:anchorId="14AE916B" wp14:editId="080D6395">
                   <wp:extent cx="868680" cy="1051560"/>
                   <wp:effectExtent l="0" t="0" r="0" b="0"/>
                   <wp:docPr id="1" name="Picture 1"/>
@@ -318,7 +318,7 @@
           <w:rFonts w:ascii="Calibri" w:eastAsia="Calibri" w:hAnsi="Calibri" w:cs="Calibri"/>
           <w:sz w:val="21"/>
         </w:rPr>
-        <w:t>College club role. Supported technical sessions for the IEEE student branch: setup, troubleshooting, and keeping events running for speakers and attendees.</w:t>
+        <w:t>College club role. Supported technical sessions for the IEEE student branch: setup, troubleshooting, and keeping events running.</w:t>
       </w:r>
     </w:p>
     <w:p>
@@ -963,31 +963,31 @@
       </w:rPr>
     </w:lvl>
   </w:abstractNum>
-  <w:num w:numId="1" w16cid:durableId="1869945235">
+  <w:num w:numId="1" w16cid:durableId="1692216458">
     <w:abstractNumId w:val="8"/>
   </w:num>
-  <w:num w:numId="2" w16cid:durableId="1223906838">
+  <w:num w:numId="2" w16cid:durableId="1983189669">
     <w:abstractNumId w:val="6"/>
   </w:num>
-  <w:num w:numId="3" w16cid:durableId="1343126744">
+  <w:num w:numId="3" w16cid:durableId="1720471540">
     <w:abstractNumId w:val="5"/>
   </w:num>
-  <w:num w:numId="4" w16cid:durableId="238180321">
+  <w:num w:numId="4" w16cid:durableId="1274358797">
     <w:abstractNumId w:val="4"/>
   </w:num>
-  <w:num w:numId="5" w16cid:durableId="550300">
+  <w:num w:numId="5" w16cid:durableId="545721605">
     <w:abstractNumId w:val="7"/>
   </w:num>
-  <w:num w:numId="6" w16cid:durableId="1054738492">
+  <w:num w:numId="6" w16cid:durableId="576983054">
     <w:abstractNumId w:val="3"/>
   </w:num>
-  <w:num w:numId="7" w16cid:durableId="1854805795">
+  <w:num w:numId="7" w16cid:durableId="1416509757">
     <w:abstractNumId w:val="2"/>
   </w:num>
-  <w:num w:numId="8" w16cid:durableId="2111704038">
+  <w:num w:numId="8" w16cid:durableId="1048997347">
     <w:abstractNumId w:val="1"/>
   </w:num>
-  <w:num w:numId="9" w16cid:durableId="600798461">
+  <w:num w:numId="9" w16cid:durableId="365954019">
     <w:abstractNumId w:val="0"/>
   </w:num>
 </w:numbering>

</xml_diff>

<commit_message>
Remove the blank second page.
</commit_message>
<xml_diff>
--- a/Bannusha_Shaik_Data_Engineer.docx
+++ b/Bannusha_Shaik_Data_Engineer.docx
@@ -17,13 +17,13 @@
         <w:tblLook w:val="04A0" w:firstRow="1" w:lastRow="0" w:firstColumn="1" w:lastColumn="0" w:noHBand="0" w:noVBand="1"/>
       </w:tblPr>
       <w:tblGrid>
-        <w:gridCol w:w="5328"/>
-        <w:gridCol w:w="5328"/>
+        <w:gridCol w:w="5400"/>
+        <w:gridCol w:w="5400"/>
       </w:tblGrid>
       <w:tr>
         <w:tc>
           <w:tcPr>
-            <w:tcW w:w="5328" w:type="dxa"/>
+            <w:tcW w:w="5400" w:type="dxa"/>
           </w:tcPr>
           <w:p>
             <w:pPr>
@@ -81,7 +81,7 @@
         </w:tc>
         <w:tc>
           <w:tcPr>
-            <w:tcW w:w="5328" w:type="dxa"/>
+            <w:tcW w:w="5400" w:type="dxa"/>
           </w:tcPr>
           <w:p>
             <w:pPr>
@@ -93,7 +93,7 @@
                 <w:noProof/>
               </w:rPr>
               <w:drawing>
-                <wp:inline distT="0" distB="0" distL="0" distR="0" wp14:anchorId="14AE916B" wp14:editId="080D6395">
+                <wp:inline distT="0" distB="0" distL="0" distR="0" wp14:anchorId="19781015" wp14:editId="2E0DBCAA">
                   <wp:extent cx="868680" cy="1051560"/>
                   <wp:effectExtent l="0" t="0" r="0" b="0"/>
                   <wp:docPr id="1" name="Picture 1"/>
@@ -736,7 +736,6 @@
           <w:rFonts w:ascii="Calibri" w:eastAsia="Calibri" w:hAnsi="Calibri" w:cs="Calibri"/>
           <w:b/>
         </w:rPr>
-        <w:lastRenderedPageBreak/>
         <w:t>Machine Learning Specialization, Coursera</w:t>
       </w:r>
       <w:r>
@@ -757,6 +756,7 @@
           <w:i/>
           <w:sz w:val="20"/>
         </w:rPr>
+        <w:lastRenderedPageBreak/>
         <w:t>coursera.org/account/accomplishments/specialization/F97RXO11QI47</w:t>
       </w:r>
     </w:p>
@@ -782,7 +782,7 @@
     </w:p>
     <w:sectPr>
       <w:pgSz w:w="12240" w:h="15840"/>
-      <w:pgMar w:top="547" w:right="792" w:bottom="403" w:left="792" w:header="720" w:footer="720" w:gutter="0"/>
+      <w:pgMar w:top="504" w:right="720" w:bottom="317" w:left="720" w:header="720" w:footer="720" w:gutter="0"/>
       <w:cols w:space="720"/>
       <w:docGrid w:linePitch="360"/>
     </w:sectPr>
@@ -963,31 +963,31 @@
       </w:rPr>
     </w:lvl>
   </w:abstractNum>
-  <w:num w:numId="1" w16cid:durableId="1692216458">
+  <w:num w:numId="1" w16cid:durableId="437455759">
     <w:abstractNumId w:val="8"/>
   </w:num>
-  <w:num w:numId="2" w16cid:durableId="1983189669">
+  <w:num w:numId="2" w16cid:durableId="610163000">
     <w:abstractNumId w:val="6"/>
   </w:num>
-  <w:num w:numId="3" w16cid:durableId="1720471540">
+  <w:num w:numId="3" w16cid:durableId="1720933653">
     <w:abstractNumId w:val="5"/>
   </w:num>
-  <w:num w:numId="4" w16cid:durableId="1274358797">
+  <w:num w:numId="4" w16cid:durableId="1739356082">
     <w:abstractNumId w:val="4"/>
   </w:num>
-  <w:num w:numId="5" w16cid:durableId="545721605">
+  <w:num w:numId="5" w16cid:durableId="1383401537">
     <w:abstractNumId w:val="7"/>
   </w:num>
-  <w:num w:numId="6" w16cid:durableId="576983054">
+  <w:num w:numId="6" w16cid:durableId="898900029">
     <w:abstractNumId w:val="3"/>
   </w:num>
-  <w:num w:numId="7" w16cid:durableId="1416509757">
+  <w:num w:numId="7" w16cid:durableId="579952239">
     <w:abstractNumId w:val="2"/>
   </w:num>
-  <w:num w:numId="8" w16cid:durableId="1048997347">
+  <w:num w:numId="8" w16cid:durableId="584875645">
     <w:abstractNumId w:val="1"/>
   </w:num>
-  <w:num w:numId="9" w16cid:durableId="365954019">
+  <w:num w:numId="9" w16cid:durableId="673727202">
     <w:abstractNumId w:val="0"/>
   </w:num>
 </w:numbering>

</xml_diff>